<commit_message>
LIGTA-S and BANTA-Y defense decks with rationale video, SDG icons and MCS slides; rationale videos, narration scripts; papers updated
</commit_message>
<xml_diff>
--- a/research/safe-shelter-open-schools/paper/Safe-Shelter-Open-Schools_MCS-T.docx
+++ b/research/safe-shelter-open-schools/paper/Safe-Shelter-Open-Schools_MCS-T.docx
@@ -360,12 +360,22 @@
     </w:p>
     <w:p>
       <w:pPr>
+        <w:pStyle w:val="TOC2"/>
+      </w:pPr>
+      <w:r>
+        <w:t xml:space="preserve">1.9 How Mathematics and Computational Sciences Come into Play</w:t>
+        <w:tab/>
+        <w:t xml:space="preserve">15</w:t>
+      </w:r>
+    </w:p>
+    <w:p>
+      <w:pPr>
         <w:pStyle w:val="TOC1"/>
       </w:pPr>
       <w:r>
         <w:t xml:space="preserve">2. FRAMEWORK</w:t>
         <w:tab/>
-        <w:t xml:space="preserve">15</w:t>
+        <w:t xml:space="preserve">16</w:t>
       </w:r>
     </w:p>
     <w:p>
@@ -375,7 +385,7 @@
       <w:r>
         <w:t xml:space="preserve">2.1 Study Area, Hazard Zones, and Scenarios</w:t>
         <w:tab/>
-        <w:t xml:space="preserve">16</w:t>
+        <w:t xml:space="preserve">17</w:t>
       </w:r>
     </w:p>
     <w:p>
@@ -385,7 +395,7 @@
       <w:r>
         <w:t xml:space="preserve">2.2 Origins and Evacuees</w:t>
         <w:tab/>
-        <w:t xml:space="preserve">17</w:t>
+        <w:t xml:space="preserve">18</w:t>
       </w:r>
     </w:p>
     <w:p>
@@ -405,7 +415,7 @@
       <w:r>
         <w:t xml:space="preserve">2.4 Shelters and the Space Standard</w:t>
         <w:tab/>
-        <w:t xml:space="preserve">18</w:t>
+        <w:t xml:space="preserve">19</w:t>
       </w:r>
     </w:p>
     <w:p>
@@ -415,7 +425,7 @@
       <w:r>
         <w:t xml:space="preserve">2.5 Shelter Tiers and Suitability</w:t>
         <w:tab/>
-        <w:t xml:space="preserve">18</w:t>
+        <w:t xml:space="preserve">19</w:t>
       </w:r>
     </w:p>
     <w:p>
@@ -425,7 +435,7 @@
       <w:r>
         <w:t xml:space="preserve">2.6 The Shelter Plan as a Lexicographic Flow</w:t>
         <w:tab/>
-        <w:t xml:space="preserve">19</w:t>
+        <w:t xml:space="preserve">20</w:t>
       </w:r>
     </w:p>
     <w:p>
@@ -435,7 +445,7 @@
       <w:r>
         <w:t xml:space="preserve">2.7 Classrooms Closed and Learners Displaced</w:t>
         <w:tab/>
-        <w:t xml:space="preserve">20</w:t>
+        <w:t xml:space="preserve">21</w:t>
       </w:r>
     </w:p>
     <w:p>
@@ -445,7 +455,7 @@
       <w:r>
         <w:t xml:space="preserve">2.8 Evacuation over Time</w:t>
         <w:tab/>
-        <w:t xml:space="preserve">20</w:t>
+        <w:t xml:space="preserve">21</w:t>
       </w:r>
     </w:p>
     <w:p>
@@ -455,7 +465,7 @@
       <w:r>
         <w:t xml:space="preserve">2.9 Bridges and Channel Closures</w:t>
         <w:tab/>
-        <w:t xml:space="preserve">21</w:t>
+        <w:t xml:space="preserve">22</w:t>
       </w:r>
     </w:p>
     <w:p>
@@ -475,7 +485,7 @@
       <w:r>
         <w:t xml:space="preserve">2.11 Baselines</w:t>
         <w:tab/>
-        <w:t xml:space="preserve">22</w:t>
+        <w:t xml:space="preserve">23</w:t>
       </w:r>
     </w:p>
     <w:p>
@@ -485,7 +495,7 @@
       <w:r>
         <w:t xml:space="preserve">2.12 Assumptions</w:t>
         <w:tab/>
-        <w:t xml:space="preserve">22</w:t>
+        <w:t xml:space="preserve">23</w:t>
       </w:r>
     </w:p>
     <w:p>
@@ -495,7 +505,7 @@
       <w:r>
         <w:t xml:space="preserve">2.13 Notation</w:t>
         <w:tab/>
-        <w:t xml:space="preserve">23</w:t>
+        <w:t xml:space="preserve">24</w:t>
       </w:r>
     </w:p>
     <w:p>
@@ -505,7 +515,7 @@
       <w:r>
         <w:t xml:space="preserve">3. FINDINGS</w:t>
         <w:tab/>
-        <w:t xml:space="preserve">24</w:t>
+        <w:t xml:space="preserve">25</w:t>
       </w:r>
     </w:p>
     <w:p>
@@ -515,7 +525,7 @@
       <w:r>
         <w:t xml:space="preserve">3.0 Data Sources and the Integrity of Results</w:t>
         <w:tab/>
-        <w:t xml:space="preserve">24</w:t>
+        <w:t xml:space="preserve">25</w:t>
       </w:r>
     </w:p>
     <w:p>
@@ -525,7 +535,7 @@
       <w:r>
         <w:t xml:space="preserve">3.1 General Methods</w:t>
         <w:tab/>
-        <w:t xml:space="preserve">24</w:t>
+        <w:t xml:space="preserve">25</w:t>
       </w:r>
     </w:p>
     <w:p>
@@ -535,7 +545,7 @@
       <w:r>
         <w:t xml:space="preserve">3.2 Theoretical Results</w:t>
         <w:tab/>
-        <w:t xml:space="preserve">25</w:t>
+        <w:t xml:space="preserve">26</w:t>
       </w:r>
     </w:p>
     <w:p>
@@ -545,7 +555,7 @@
       <w:r>
         <w:t xml:space="preserve">3.3 Software Verification</w:t>
         <w:tab/>
-        <w:t xml:space="preserve">30</w:t>
+        <w:t xml:space="preserve">31</w:t>
       </w:r>
     </w:p>
     <w:p>
@@ -555,7 +565,7 @@
       <w:r>
         <w:t xml:space="preserve">3.4 Computational Cost</w:t>
         <w:tab/>
-        <w:t xml:space="preserve">31</w:t>
+        <w:t xml:space="preserve">32</w:t>
       </w:r>
     </w:p>
     <w:p>
@@ -565,7 +575,7 @@
       <w:r>
         <w:t xml:space="preserve">3.5 Worked Instance E1</w:t>
         <w:tab/>
-        <w:t xml:space="preserve">32</w:t>
+        <w:t xml:space="preserve">33</w:t>
       </w:r>
     </w:p>
     <w:p>
@@ -575,7 +585,7 @@
       <w:r>
         <w:t xml:space="preserve">3.5.1 Shelter Plans on E1</w:t>
         <w:tab/>
-        <w:t xml:space="preserve">34</w:t>
+        <w:t xml:space="preserve">35</w:t>
       </w:r>
     </w:p>
     <w:p>
@@ -585,7 +595,7 @@
       <w:r>
         <w:t xml:space="preserve">3.5.2 Classrooms and Learners</w:t>
         <w:tab/>
-        <w:t xml:space="preserve">36</w:t>
+        <w:t xml:space="preserve">37</w:t>
       </w:r>
     </w:p>
     <w:p>
@@ -595,7 +605,7 @@
       <w:r>
         <w:t xml:space="preserve">3.5.3 Evacuation over Time and the Lahar Bridges</w:t>
         <w:tab/>
-        <w:t xml:space="preserve">36</w:t>
+        <w:t xml:space="preserve">37</w:t>
       </w:r>
     </w:p>
     <w:p>
@@ -605,7 +615,7 @@
       <w:r>
         <w:t xml:space="preserve">3.5.4 Where to Build Ligtas Pinoy Centers on E1</w:t>
         <w:tab/>
-        <w:t xml:space="preserve">37</w:t>
+        <w:t xml:space="preserve">38</w:t>
       </w:r>
     </w:p>
     <w:p>
@@ -615,7 +625,7 @@
       <w:r>
         <w:t xml:space="preserve">3.6 Planned Experiments on the Albay Open-Data Set</w:t>
         <w:tab/>
-        <w:t xml:space="preserve">38</w:t>
+        <w:t xml:space="preserve">39</w:t>
       </w:r>
     </w:p>
     <w:p>
@@ -625,7 +635,7 @@
       <w:r>
         <w:t xml:space="preserve">3.6.1 Sensitivity Analysis</w:t>
         <w:tab/>
-        <w:t xml:space="preserve">38</w:t>
+        <w:t xml:space="preserve">39</w:t>
       </w:r>
     </w:p>
     <w:p>
@@ -635,7 +645,7 @@
       <w:r>
         <w:t xml:space="preserve">3.6.2 Statistical Treatment</w:t>
         <w:tab/>
-        <w:t xml:space="preserve">38</w:t>
+        <w:t xml:space="preserve">39</w:t>
       </w:r>
     </w:p>
     <w:p>
@@ -645,7 +655,7 @@
       <w:r>
         <w:t xml:space="preserve">3.6.3 Model Hypotheses Fixed in Advance</w:t>
         <w:tab/>
-        <w:t xml:space="preserve">39</w:t>
+        <w:t xml:space="preserve">40</w:t>
       </w:r>
     </w:p>
     <w:p>
@@ -655,7 +665,7 @@
       <w:r>
         <w:t xml:space="preserve">3.6.4 Sensitivity Sweeps</w:t>
         <w:tab/>
-        <w:t xml:space="preserve">40</w:t>
+        <w:t xml:space="preserve">41</w:t>
       </w:r>
     </w:p>
     <w:p>
@@ -665,7 +675,7 @@
       <w:r>
         <w:t xml:space="preserve">4. CONCLUSIONS</w:t>
         <w:tab/>
-        <w:t xml:space="preserve">40</w:t>
+        <w:t xml:space="preserve">41</w:t>
       </w:r>
     </w:p>
     <w:p>
@@ -675,7 +685,7 @@
       <w:r>
         <w:t xml:space="preserve">4.1 Evaluation of the Findings</w:t>
         <w:tab/>
-        <w:t xml:space="preserve">40</w:t>
+        <w:t xml:space="preserve">41</w:t>
       </w:r>
     </w:p>
     <w:p>
@@ -685,7 +695,7 @@
       <w:r>
         <w:t xml:space="preserve">4.2 Limitations</w:t>
         <w:tab/>
-        <w:t xml:space="preserve">42</w:t>
+        <w:t xml:space="preserve">43</w:t>
       </w:r>
     </w:p>
     <w:p>
@@ -695,7 +705,7 @@
       <w:r>
         <w:t xml:space="preserve">4.3 Recommendations and Challenges in Extending the Results</w:t>
         <w:tab/>
-        <w:t xml:space="preserve">43</w:t>
+        <w:t xml:space="preserve">44</w:t>
       </w:r>
     </w:p>
     <w:p>
@@ -705,7 +715,7 @@
       <w:r>
         <w:t xml:space="preserve">4.4 Applications</w:t>
         <w:tab/>
-        <w:t xml:space="preserve">44</w:t>
+        <w:t xml:space="preserve">45</w:t>
       </w:r>
     </w:p>
     <w:p>
@@ -715,7 +725,7 @@
       <w:r>
         <w:t xml:space="preserve">5. REFERENCES</w:t>
         <w:tab/>
-        <w:t xml:space="preserve">44</w:t>
+        <w:t xml:space="preserve">45</w:t>
       </w:r>
     </w:p>
     <w:p>
@@ -725,7 +735,7 @@
       <w:r>
         <w:t xml:space="preserve">APPENDIX A. OPEN DATA SOURCE REGISTER</w:t>
         <w:tab/>
-        <w:t xml:space="preserve">49</w:t>
+        <w:t xml:space="preserve">50</w:t>
       </w:r>
     </w:p>
     <w:p>
@@ -735,7 +745,7 @@
       <w:r>
         <w:t xml:space="preserve">APPENDIX B. DATA FILES PRODUCED</w:t>
         <w:tab/>
-        <w:t xml:space="preserve">49</w:t>
+        <w:t xml:space="preserve">50</w:t>
       </w:r>
     </w:p>
     <w:p>
@@ -745,7 +755,7 @@
       <w:r>
         <w:t xml:space="preserve">APPENDIX C. RULES FOR INCLUDING SHELTERS AND THE INVENTORY SCHEMA</w:t>
         <w:tab/>
-        <w:t xml:space="preserve">50</w:t>
+        <w:t xml:space="preserve">51</w:t>
       </w:r>
     </w:p>
     <w:p>
@@ -755,7 +765,7 @@
       <w:r>
         <w:t xml:space="preserve">APPENDIX D. APPLICATION FEATURE CHECKLIST</w:t>
         <w:tab/>
-        <w:t xml:space="preserve">50</w:t>
+        <w:t xml:space="preserve">51</w:t>
       </w:r>
     </w:p>
     <w:p>
@@ -765,7 +775,7 @@
       <w:r>
         <w:t xml:space="preserve">APPENDIX E. RISK REGISTER</w:t>
         <w:tab/>
-        <w:t xml:space="preserve">51</w:t>
+        <w:t xml:space="preserve">52</w:t>
       </w:r>
     </w:p>
     <w:p>
@@ -775,7 +785,7 @@
       <w:r>
         <w:t xml:space="preserve">APPENDIX F. REPRODUCING THE RESULTS</w:t>
         <w:tab/>
-        <w:t xml:space="preserve">52</w:t>
+        <w:t xml:space="preserve">53</w:t>
       </w:r>
     </w:p>
     <w:p>
@@ -785,7 +795,7 @@
       <w:r>
         <w:t xml:space="preserve">ETHICS STATEMENT</w:t>
         <w:tab/>
-        <w:t xml:space="preserve">52</w:t>
+        <w:t xml:space="preserve">53</w:t>
       </w:r>
     </w:p>
     <w:p>
@@ -866,7 +876,7 @@
       </w:r>
     </w:p>
     <w:bookmarkEnd w:id="23"/>
-    <w:bookmarkStart w:id="42" w:name="introduction"/>
+    <w:bookmarkStart w:id="46" w:name="introduction"/>
     <w:p>
       <w:pPr>
         <w:pStyle w:val="Heading1"/>
@@ -2997,7 +3007,7 @@
       </w:r>
     </w:p>
     <w:bookmarkEnd w:id="40"/>
-    <w:bookmarkStart w:id="41" w:name="X2b3e2e097265b20d9fca8b955088efdfa0d15bb"/>
+    <w:bookmarkStart w:id="44" w:name="X2b3e2e097265b20d9fca8b955088efdfa0d15bb"/>
     <w:p>
       <w:pPr>
         <w:pStyle w:val="Heading2"/>
@@ -3020,25 +3030,6 @@
       </w:pPr>
       <w:r>
         <w:t xml:space="preserve">The study bears most directly on two goals: Sustainable Cities and Communities (SDG 11), via target 11.5 on reducing the people affected by disasters, and Climate Action (SDG 13), via target 13.1 on resilience to climate-related hazards. The classroom measures serve SDG 4, Quality Education, through target 4.a on safe learning environments: every classroom the plan keeps open is a class that keeps meeting. The vulnerable-first level relates to SDG 10, Reduced Inequalities (target 10.2), and the siting tool to SDG 1 (target 1.5, resilience of the poor). Each of these links is a likely use of the work, not a demonstrated outcome.</w:t>
-      </w:r>
-    </w:p>
-    <w:bookmarkEnd w:id="41"/>
-    <w:bookmarkEnd w:id="42"/>
-    <w:bookmarkStart w:id="95" w:name="framework"/>
-    <w:p>
-      <w:pPr>
-        <w:pStyle w:val="Heading1"/>
-      </w:pPr>
-      <w:r>
-        <w:t xml:space="preserve">2. FRAMEWORK</w:t>
-      </w:r>
-    </w:p>
-    <w:p>
-      <w:pPr>
-        <w:pStyle w:val="FirstParagraph"/>
-      </w:pPr>
-      <w:r>
-        <w:t xml:space="preserve">Figure 1 shows the three layers of the framework. Sections 2.1 to 2.5 set out the data layer: hazard scenarios, the residents who must leave, the roads they travel, and the shelters able to receive them. Sections 2.6 and 2.7 form the planning layer, which assigns each evacuee to a shelter. Sections 2.8 to 2.10 make up the time and siting layer, which estimates how long the evacuation lasts, identifies the bridges that matter, and chooses sites for new evacuation centers.</w:t>
       </w:r>
     </w:p>
     <w:p>
@@ -3048,20 +3039,186 @@
       <w:r>
         <w:drawing>
           <wp:inline>
-            <wp:extent cx="5334000" cy="3520439"/>
+            <wp:extent cx="5334000" cy="1012784"/>
             <wp:effectExtent b="0" l="0" r="0" t="0"/>
-            <wp:docPr descr="" title="" id="44" name="Picture"/>
+            <wp:docPr descr="" title="" id="42" name="Picture"/>
             <a:graphic>
               <a:graphicData uri="http://schemas.openxmlformats.org/drawingml/2006/picture">
                 <pic:pic>
                   <pic:nvPicPr>
-                    <pic:cNvPr descr="/home/user/MAP---A/research/safe-shelter-open-schools/paper/fig_framework.png" id="45" name="Picture"/>
+                    <pic:cNvPr descr="/home/user/MAP---A/research/safe-shelter-open-schools/paper/fig_sdg.png" id="43" name="Picture"/>
                     <pic:cNvPicPr>
                       <a:picLocks noChangeArrowheads="1" noChangeAspect="1"/>
                     </pic:cNvPicPr>
                   </pic:nvPicPr>
                   <pic:blipFill>
-                    <a:blip r:embed="rId43"/>
+                    <a:blip r:embed="rId41"/>
+                    <a:stretch>
+                      <a:fillRect/>
+                    </a:stretch>
+                  </pic:blipFill>
+                  <pic:spPr bwMode="auto">
+                    <a:xfrm>
+                      <a:off x="0" y="0"/>
+                      <a:ext cx="5334000" cy="1012784"/>
+                    </a:xfrm>
+                    <a:prstGeom prst="rect">
+                      <a:avLst/>
+                    </a:prstGeom>
+                    <a:noFill/>
+                    <a:ln w="9525">
+                      <a:noFill/>
+                      <a:headEnd/>
+                      <a:tailEnd/>
+                    </a:ln>
+                  </pic:spPr>
+                </pic:pic>
+              </a:graphicData>
+            </a:graphic>
+          </wp:inline>
+        </w:drawing>
+      </w:r>
+    </w:p>
+    <w:p>
+      <w:pPr>
+        <w:pStyle w:val="SourceLine"/>
+      </w:pPr>
+      <w:r>
+        <w:t xml:space="preserve">SDG icons: United Nations</w:t>
+      </w:r>
+    </w:p>
+    <w:bookmarkEnd w:id="44"/>
+    <w:bookmarkStart w:id="45" w:name="Xa530e5f306b31b5405447ca7a240a2750115c64"/>
+    <w:p>
+      <w:pPr>
+        <w:pStyle w:val="Heading2"/>
+      </w:pPr>
+      <w:r>
+        <w:t xml:space="preserve">1.9 How Mathematics and Computational Sciences Come into Play</w:t>
+      </w:r>
+    </w:p>
+    <w:p>
+      <w:pPr>
+        <w:pStyle w:val="FirstParagraph"/>
+      </w:pPr>
+      <w:r>
+        <w:t xml:space="preserve">This is a study in Mathematics and Computational Sciences in a precise sense: each of its three parts does work that the other two cannot.</w:t>
+      </w:r>
+    </w:p>
+    <w:p>
+      <w:pPr>
+        <w:numPr>
+          <w:ilvl w:val="0"/>
+          <w:numId w:val="1004"/>
+        </w:numPr>
+        <w:pStyle w:val="Compact"/>
+      </w:pPr>
+      <w:r>
+        <w:rPr>
+          <w:bCs/>
+          <w:b/>
+        </w:rPr>
+        <w:t xml:space="preserve">Mathematics</w:t>
+      </w:r>
+      <w:r>
+        <w:t xml:space="preserve"> </w:t>
+      </w:r>
+      <w:r>
+        <w:t xml:space="preserve">states the problem exactly. Roads become a graph with travel times and capacities, shelters become three tiers of capacity, and the legal order of priorities becomes a lexicographic minimum-cost flow. Ten propositions then say what any plan of this kind can and cannot do.</w:t>
+      </w:r>
+    </w:p>
+    <w:p>
+      <w:pPr>
+        <w:numPr>
+          <w:ilvl w:val="0"/>
+          <w:numId w:val="1004"/>
+        </w:numPr>
+        <w:pStyle w:val="Compact"/>
+      </w:pPr>
+      <w:r>
+        <w:rPr>
+          <w:bCs/>
+          <w:b/>
+        </w:rPr>
+        <w:t xml:space="preserve">Computation</w:t>
+      </w:r>
+      <w:r>
+        <w:t xml:space="preserve"> </w:t>
+      </w:r>
+      <w:r>
+        <w:t xml:space="preserve">turns those statements into answers. An exact flow solver produces a plan in seconds, a time-expanded network gives the clearance time by bisection, and a greedy rule sites new centers with a proven guarantee.</w:t>
+      </w:r>
+    </w:p>
+    <w:p>
+      <w:pPr>
+        <w:numPr>
+          <w:ilvl w:val="0"/>
+          <w:numId w:val="1004"/>
+        </w:numPr>
+        <w:pStyle w:val="Compact"/>
+      </w:pPr>
+      <w:r>
+        <w:rPr>
+          <w:bCs/>
+          <w:b/>
+        </w:rPr>
+        <w:t xml:space="preserve">Science</w:t>
+      </w:r>
+      <w:r>
+        <w:t xml:space="preserve"> </w:t>
+      </w:r>
+      <w:r>
+        <w:t xml:space="preserve">keeps the work honest. Every input comes from a public register or a published standard, every proposition was tested against separately written code, and every number in Chapter 3 can be reproduced from one seeded script.</w:t>
+      </w:r>
+    </w:p>
+    <w:p>
+      <w:pPr>
+        <w:pStyle w:val="FirstParagraph"/>
+      </w:pPr>
+      <w:r>
+        <w:t xml:space="preserve">Together the three move from open data to a graph, from the graph to an algorithm, from the algorithm to numbers, and from the numbers to a plan that is both optimal and proven (Figure 1).</w:t>
+      </w:r>
+    </w:p>
+    <w:bookmarkEnd w:id="45"/>
+    <w:bookmarkEnd w:id="46"/>
+    <w:bookmarkStart w:id="99" w:name="framework"/>
+    <w:p>
+      <w:pPr>
+        <w:pStyle w:val="Heading1"/>
+      </w:pPr>
+      <w:r>
+        <w:t xml:space="preserve">2. FRAMEWORK</w:t>
+      </w:r>
+    </w:p>
+    <w:p>
+      <w:pPr>
+        <w:pStyle w:val="FirstParagraph"/>
+      </w:pPr>
+      <w:r>
+        <w:t xml:space="preserve">Figure 1 shows the three layers of the framework. Sections 2.1 to 2.5 set out the data layer: hazard scenarios, the residents who must leave, the roads they travel, and the shelters able to receive them. Sections 2.6 and 2.7 form the planning layer, which assigns each evacuee to a shelter. Sections 2.8 to 2.10 make up the time and siting layer, which estimates how long the evacuation lasts, identifies the bridges that matter, and chooses sites for new evacuation centers.</w:t>
+      </w:r>
+    </w:p>
+    <w:p>
+      <w:pPr>
+        <w:pStyle w:val="FigurePara"/>
+      </w:pPr>
+      <w:r>
+        <w:drawing>
+          <wp:inline>
+            <wp:extent cx="5334000" cy="3520439"/>
+            <wp:effectExtent b="0" l="0" r="0" t="0"/>
+            <wp:docPr descr="" title="" id="48" name="Picture"/>
+            <a:graphic>
+              <a:graphicData uri="http://schemas.openxmlformats.org/drawingml/2006/picture">
+                <pic:pic>
+                  <pic:nvPicPr>
+                    <pic:cNvPr descr="/home/user/MAP---A/research/safe-shelter-open-schools/paper/fig_framework.png" id="49" name="Picture"/>
+                    <pic:cNvPicPr>
+                      <a:picLocks noChangeArrowheads="1" noChangeAspect="1"/>
+                    </pic:cNvPicPr>
+                  </pic:nvPicPr>
+                  <pic:blipFill>
+                    <a:blip r:embed="rId47"/>
                     <a:stretch>
                       <a:fillRect/>
                     </a:stretch>
@@ -3106,7 +3263,7 @@
         <w:t xml:space="preserve">How the model turns open data into an evacuation plan. The data layer is drawn in blue, the planning layer in orange, and the time and siting layer in green.</w:t>
       </w:r>
     </w:p>
-    <w:bookmarkStart w:id="49" w:name="study-area-hazard-zones-and-scenarios"/>
+    <w:bookmarkStart w:id="53" w:name="study-area-hazard-zones-and-scenarios"/>
     <w:p>
       <w:pPr>
         <w:pStyle w:val="Heading2"/>
@@ -3500,18 +3657,18 @@
                 <wp:inline>
                   <wp:extent cx="829360" cy="152456"/>
                   <wp:effectExtent b="0" l="0" r="0" t="0"/>
-                  <wp:docPr descr="" title="" id="47" name="Picture"/>
+                  <wp:docPr descr="" title="" id="51" name="Picture"/>
                   <a:graphic>
                     <a:graphicData uri="http://schemas.openxmlformats.org/drawingml/2006/picture">
                       <pic:pic>
                         <pic:nvPicPr>
-                          <pic:cNvPr descr="/home/user/MAP---A/research/safe-shelter-open-schools/paper/eq/eq_8f9a959037081639.png" id="48" name="Picture"/>
+                          <pic:cNvPr descr="/home/user/MAP---A/research/safe-shelter-open-schools/paper/eq/eq_8f9a959037081639.png" id="52" name="Picture"/>
                           <pic:cNvPicPr>
                             <a:picLocks noChangeArrowheads="1" noChangeAspect="1"/>
                           </pic:cNvPicPr>
                         </pic:nvPicPr>
                         <pic:blipFill>
-                          <a:blip r:embed="rId46"/>
+                          <a:blip r:embed="rId50"/>
                           <a:stretch>
                             <a:fillRect/>
                           </a:stretch>
@@ -4076,8 +4233,8 @@
         </w:tc>
       </w:tr>
     </w:tbl>
-    <w:bookmarkEnd w:id="49"/>
-    <w:bookmarkStart w:id="53" w:name="origins-and-evacuees"/>
+    <w:bookmarkEnd w:id="53"/>
+    <w:bookmarkStart w:id="57" w:name="origins-and-evacuees"/>
     <w:p>
       <w:pPr>
         <w:pStyle w:val="Heading2"/>
@@ -4294,18 +4451,18 @@
                 <wp:inline>
                   <wp:extent cx="3837736" cy="182894"/>
                   <wp:effectExtent b="0" l="0" r="0" t="0"/>
-                  <wp:docPr descr="" title="" id="51" name="Picture"/>
+                  <wp:docPr descr="" title="" id="55" name="Picture"/>
                   <a:graphic>
                     <a:graphicData uri="http://schemas.openxmlformats.org/drawingml/2006/picture">
                       <pic:pic>
                         <pic:nvPicPr>
-                          <pic:cNvPr descr="/home/user/MAP---A/research/safe-shelter-open-schools/paper/eq/eq_116199c8a6190f1b.png" id="52" name="Picture"/>
+                          <pic:cNvPr descr="/home/user/MAP---A/research/safe-shelter-open-schools/paper/eq/eq_116199c8a6190f1b.png" id="56" name="Picture"/>
                           <pic:cNvPicPr>
                             <a:picLocks noChangeArrowheads="1" noChangeAspect="1"/>
                           </pic:cNvPicPr>
                         </pic:nvPicPr>
                         <pic:blipFill>
-                          <a:blip r:embed="rId50"/>
+                          <a:blip r:embed="rId54"/>
                           <a:stretch>
                             <a:fillRect/>
                           </a:stretch>
@@ -4463,8 +4620,8 @@
         <w:t xml:space="preserve">Origins are fixed places named in public registers, as in the companion study (Brimbuela et al., 2026); barangay populations come from the 2020 census and the vulnerable counts from the census age structure and the barangay registries kept under the laws on senior citizens and persons with disability.</w:t>
       </w:r>
     </w:p>
-    <w:bookmarkEnd w:id="53"/>
-    <w:bookmarkStart w:id="54" w:name="road-network-travel-time-and-capacity"/>
+    <w:bookmarkEnd w:id="57"/>
+    <w:bookmarkStart w:id="58" w:name="road-network-travel-time-and-capacity"/>
     <w:p>
       <w:pPr>
         <w:pStyle w:val="Heading2"/>
@@ -4776,8 +4933,8 @@
         <w:t xml:space="preserve">The transit time comes from the length of the road and a speed for its class, and the capacity from its lanes and the trucks the local government assigns; both are declared parameters (Section 2.12), varied in the sensitivity sweeps of Section 3.6.</w:t>
       </w:r>
     </w:p>
-    <w:bookmarkEnd w:id="54"/>
-    <w:bookmarkStart w:id="58" w:name="shelters-and-the-space-standard"/>
+    <w:bookmarkEnd w:id="58"/>
+    <w:bookmarkStart w:id="62" w:name="shelters-and-the-space-standard"/>
     <w:p>
       <w:pPr>
         <w:pStyle w:val="Heading2"/>
@@ -4904,18 +5061,18 @@
                 <wp:inline>
                   <wp:extent cx="2246680" cy="365809"/>
                   <wp:effectExtent b="0" l="0" r="0" t="0"/>
-                  <wp:docPr descr="" title="" id="56" name="Picture"/>
+                  <wp:docPr descr="" title="" id="60" name="Picture"/>
                   <a:graphic>
                     <a:graphicData uri="http://schemas.openxmlformats.org/drawingml/2006/picture">
                       <pic:pic>
                         <pic:nvPicPr>
-                          <pic:cNvPr descr="/home/user/MAP---A/research/safe-shelter-open-schools/paper/eq/eq_9c57bbab0468fc40.png" id="57" name="Picture"/>
+                          <pic:cNvPr descr="/home/user/MAP---A/research/safe-shelter-open-schools/paper/eq/eq_9c57bbab0468fc40.png" id="61" name="Picture"/>
                           <pic:cNvPicPr>
                             <a:picLocks noChangeArrowheads="1" noChangeAspect="1"/>
                           </pic:cNvPicPr>
                         </pic:nvPicPr>
                         <pic:blipFill>
-                          <a:blip r:embed="rId55"/>
+                          <a:blip r:embed="rId59"/>
                           <a:stretch>
                             <a:fillRect/>
                           </a:stretch>
@@ -5106,8 +5263,8 @@
         <w:t xml:space="preserve">.</w:t>
       </w:r>
     </w:p>
-    <w:bookmarkEnd w:id="58"/>
-    <w:bookmarkStart w:id="65" w:name="shelter-tiers-and-suitability"/>
+    <w:bookmarkEnd w:id="62"/>
+    <w:bookmarkStart w:id="69" w:name="shelter-tiers-and-suitability"/>
     <w:p>
       <w:pPr>
         <w:pStyle w:val="Heading2"/>
@@ -5188,18 +5345,18 @@
                 <wp:inline>
                   <wp:extent cx="2898648" cy="192024"/>
                   <wp:effectExtent b="0" l="0" r="0" t="0"/>
-                  <wp:docPr descr="" title="" id="60" name="Picture"/>
+                  <wp:docPr descr="" title="" id="64" name="Picture"/>
                   <a:graphic>
                     <a:graphicData uri="http://schemas.openxmlformats.org/drawingml/2006/picture">
                       <pic:pic>
                         <pic:nvPicPr>
-                          <pic:cNvPr descr="/home/user/MAP---A/research/safe-shelter-open-schools/paper/eq/eq_c6ec7eb9993aedd5.png" id="61" name="Picture"/>
+                          <pic:cNvPr descr="/home/user/MAP---A/research/safe-shelter-open-schools/paper/eq/eq_c6ec7eb9993aedd5.png" id="65" name="Picture"/>
                           <pic:cNvPicPr>
                             <a:picLocks noChangeArrowheads="1" noChangeAspect="1"/>
                           </pic:cNvPicPr>
                         </pic:nvPicPr>
                         <pic:blipFill>
-                          <a:blip r:embed="rId59"/>
+                          <a:blip r:embed="rId63"/>
                           <a:stretch>
                             <a:fillRect/>
                           </a:stretch>
@@ -5714,18 +5871,18 @@
                 <wp:inline>
                   <wp:extent cx="3486607" cy="182864"/>
                   <wp:effectExtent b="0" l="0" r="0" t="0"/>
-                  <wp:docPr descr="" title="" id="63" name="Picture"/>
+                  <wp:docPr descr="" title="" id="67" name="Picture"/>
                   <a:graphic>
                     <a:graphicData uri="http://schemas.openxmlformats.org/drawingml/2006/picture">
                       <pic:pic>
                         <pic:nvPicPr>
-                          <pic:cNvPr descr="/home/user/MAP---A/research/safe-shelter-open-schools/paper/eq/eq_5284e98849df9f6f.png" id="64" name="Picture"/>
+                          <pic:cNvPr descr="/home/user/MAP---A/research/safe-shelter-open-schools/paper/eq/eq_5284e98849df9f6f.png" id="68" name="Picture"/>
                           <pic:cNvPicPr>
                             <a:picLocks noChangeArrowheads="1" noChangeAspect="1"/>
                           </pic:cNvPicPr>
                         </pic:nvPicPr>
                         <pic:blipFill>
-                          <a:blip r:embed="rId62"/>
+                          <a:blip r:embed="rId66"/>
                           <a:stretch>
                             <a:fillRect/>
                           </a:stretch>
@@ -5831,8 +5988,8 @@
         <w:t xml:space="preserve">= 1 when the shelter is accessible: ground level or ramped, with an accessible toilet. Shelters inside an active zone are removed before the plan is made.</w:t>
       </w:r>
     </w:p>
-    <w:bookmarkEnd w:id="65"/>
-    <w:bookmarkStart w:id="75" w:name="the-shelter-plan-as-a-lexicographic-flow"/>
+    <w:bookmarkEnd w:id="69"/>
+    <w:bookmarkStart w:id="79" w:name="the-shelter-plan-as-a-lexicographic-flow"/>
     <w:p>
       <w:pPr>
         <w:pStyle w:val="Heading2"/>
@@ -5977,18 +6134,18 @@
                 <wp:inline>
                   <wp:extent cx="4181551" cy="298682"/>
                   <wp:effectExtent b="0" l="0" r="0" t="0"/>
-                  <wp:docPr descr="" title="" id="67" name="Picture"/>
+                  <wp:docPr descr="" title="" id="71" name="Picture"/>
                   <a:graphic>
                     <a:graphicData uri="http://schemas.openxmlformats.org/drawingml/2006/picture">
                       <pic:pic>
                         <pic:nvPicPr>
-                          <pic:cNvPr descr="/home/user/MAP---A/research/safe-shelter-open-schools/paper/eq/eq_6c479f8ce1d207c2.png" id="68" name="Picture"/>
+                          <pic:cNvPr descr="/home/user/MAP---A/research/safe-shelter-open-schools/paper/eq/eq_6c479f8ce1d207c2.png" id="72" name="Picture"/>
                           <pic:cNvPicPr>
                             <a:picLocks noChangeArrowheads="1" noChangeAspect="1"/>
                           </pic:cNvPicPr>
                         </pic:nvPicPr>
                         <pic:blipFill>
-                          <a:blip r:embed="rId66"/>
+                          <a:blip r:embed="rId70"/>
                           <a:stretch>
                             <a:fillRect/>
                           </a:stretch>
@@ -6336,18 +6493,18 @@
                 <wp:inline>
                   <wp:extent cx="2910535" cy="128002"/>
                   <wp:effectExtent b="0" l="0" r="0" t="0"/>
-                  <wp:docPr descr="" title="" id="70" name="Picture"/>
+                  <wp:docPr descr="" title="" id="74" name="Picture"/>
                   <a:graphic>
                     <a:graphicData uri="http://schemas.openxmlformats.org/drawingml/2006/picture">
                       <pic:pic>
                         <pic:nvPicPr>
-                          <pic:cNvPr descr="/home/user/MAP---A/research/safe-shelter-open-schools/paper/eq/eq_7ed785847cca389a.png" id="71" name="Picture"/>
+                          <pic:cNvPr descr="/home/user/MAP---A/research/safe-shelter-open-schools/paper/eq/eq_7ed785847cca389a.png" id="75" name="Picture"/>
                           <pic:cNvPicPr>
                             <a:picLocks noChangeArrowheads="1" noChangeAspect="1"/>
                           </pic:cNvPicPr>
                         </pic:nvPicPr>
                         <pic:blipFill>
-                          <a:blip r:embed="rId69"/>
+                          <a:blip r:embed="rId73"/>
                           <a:stretch>
                             <a:fillRect/>
                           </a:stretch>
@@ -6517,18 +6674,18 @@
                 <wp:inline>
                   <wp:extent cx="3371392" cy="182896"/>
                   <wp:effectExtent b="0" l="0" r="0" t="0"/>
-                  <wp:docPr descr="" title="" id="73" name="Picture"/>
+                  <wp:docPr descr="" title="" id="77" name="Picture"/>
                   <a:graphic>
                     <a:graphicData uri="http://schemas.openxmlformats.org/drawingml/2006/picture">
                       <pic:pic>
                         <pic:nvPicPr>
-                          <pic:cNvPr descr="/home/user/MAP---A/research/safe-shelter-open-schools/paper/eq/eq_e6cea05e7ad5dc82.png" id="74" name="Picture"/>
+                          <pic:cNvPr descr="/home/user/MAP---A/research/safe-shelter-open-schools/paper/eq/eq_e6cea05e7ad5dc82.png" id="78" name="Picture"/>
                           <pic:cNvPicPr>
                             <a:picLocks noChangeArrowheads="1" noChangeAspect="1"/>
                           </pic:cNvPicPr>
                         </pic:nvPicPr>
                         <pic:blipFill>
-                          <a:blip r:embed="rId72"/>
+                          <a:blip r:embed="rId76"/>
                           <a:stretch>
                             <a:fillRect/>
                           </a:stretch>
@@ -6923,8 +7080,8 @@
         <w:t xml:space="preserve"> 7  return x, Y(x), O(x), Theta(x), classrooms closed (Definition 9)</w:t>
       </w:r>
     </w:p>
-    <w:bookmarkEnd w:id="75"/>
-    <w:bookmarkStart w:id="79" w:name="classrooms-closed-and-learners-displaced"/>
+    <w:bookmarkEnd w:id="79"/>
+    <w:bookmarkStart w:id="83" w:name="classrooms-closed-and-learners-displaced"/>
     <w:p>
       <w:pPr>
         <w:pStyle w:val="Heading2"/>
@@ -7016,18 +7173,18 @@
                 <wp:inline>
                   <wp:extent cx="4505248" cy="365784"/>
                   <wp:effectExtent b="0" l="0" r="0" t="0"/>
-                  <wp:docPr descr="" title="" id="77" name="Picture"/>
+                  <wp:docPr descr="" title="" id="81" name="Picture"/>
                   <a:graphic>
                     <a:graphicData uri="http://schemas.openxmlformats.org/drawingml/2006/picture">
                       <pic:pic>
                         <pic:nvPicPr>
-                          <pic:cNvPr descr="/home/user/MAP---A/research/safe-shelter-open-schools/paper/eq/eq_0a50603e96fd881e.png" id="78" name="Picture"/>
+                          <pic:cNvPr descr="/home/user/MAP---A/research/safe-shelter-open-schools/paper/eq/eq_0a50603e96fd881e.png" id="82" name="Picture"/>
                           <pic:cNvPicPr>
                             <a:picLocks noChangeArrowheads="1" noChangeAspect="1"/>
                           </pic:cNvPicPr>
                         </pic:nvPicPr>
                         <pic:blipFill>
-                          <a:blip r:embed="rId76"/>
+                          <a:blip r:embed="rId80"/>
                           <a:stretch>
                             <a:fillRect/>
                           </a:stretch>
@@ -7161,8 +7318,8 @@
         <w:t xml:space="preserve">learner-days of face-to-face schooling.</w:t>
       </w:r>
     </w:p>
-    <w:bookmarkEnd w:id="79"/>
-    <w:bookmarkStart w:id="83" w:name="evacuation-over-time"/>
+    <w:bookmarkEnd w:id="83"/>
+    <w:bookmarkStart w:id="87" w:name="evacuation-over-time"/>
     <w:p>
       <w:pPr>
         <w:pStyle w:val="Heading2"/>
@@ -7702,18 +7859,18 @@
                 <wp:inline>
                   <wp:extent cx="1954072" cy="164617"/>
                   <wp:effectExtent b="0" l="0" r="0" t="0"/>
-                  <wp:docPr descr="" title="" id="81" name="Picture"/>
+                  <wp:docPr descr="" title="" id="85" name="Picture"/>
                   <a:graphic>
                     <a:graphicData uri="http://schemas.openxmlformats.org/drawingml/2006/picture">
                       <pic:pic>
                         <pic:nvPicPr>
-                          <pic:cNvPr descr="/home/user/MAP---A/research/safe-shelter-open-schools/paper/eq/eq_eff0930bfc1e2f7c.png" id="82" name="Picture"/>
+                          <pic:cNvPr descr="/home/user/MAP---A/research/safe-shelter-open-schools/paper/eq/eq_eff0930bfc1e2f7c.png" id="86" name="Picture"/>
                           <pic:cNvPicPr>
                             <a:picLocks noChangeArrowheads="1" noChangeAspect="1"/>
                           </pic:cNvPicPr>
                         </pic:nvPicPr>
                         <pic:blipFill>
-                          <a:blip r:embed="rId80"/>
+                          <a:blip r:embed="rId84"/>
                           <a:stretch>
                             <a:fillRect/>
                           </a:stretch>
@@ -7904,8 +8061,8 @@
         <w:t xml:space="preserve"> 7  return hi</w:t>
       </w:r>
     </w:p>
-    <w:bookmarkEnd w:id="83"/>
-    <w:bookmarkStart w:id="87" w:name="bridges-and-channel-closures"/>
+    <w:bookmarkEnd w:id="87"/>
+    <w:bookmarkStart w:id="91" w:name="bridges-and-channel-closures"/>
     <w:p>
       <w:pPr>
         <w:pStyle w:val="Heading2"/>
@@ -7992,18 +8149,18 @@
                 <wp:inline>
                   <wp:extent cx="990295" cy="158447"/>
                   <wp:effectExtent b="0" l="0" r="0" t="0"/>
-                  <wp:docPr descr="" title="" id="85" name="Picture"/>
+                  <wp:docPr descr="" title="" id="89" name="Picture"/>
                   <a:graphic>
                     <a:graphicData uri="http://schemas.openxmlformats.org/drawingml/2006/picture">
                       <pic:pic>
                         <pic:nvPicPr>
-                          <pic:cNvPr descr="/home/user/MAP---A/research/safe-shelter-open-schools/paper/eq/eq_aa776d2f3a26413a.png" id="86" name="Picture"/>
+                          <pic:cNvPr descr="/home/user/MAP---A/research/safe-shelter-open-schools/paper/eq/eq_aa776d2f3a26413a.png" id="90" name="Picture"/>
                           <pic:cNvPicPr>
                             <a:picLocks noChangeArrowheads="1" noChangeAspect="1"/>
                           </pic:cNvPicPr>
                         </pic:nvPicPr>
                         <pic:blipFill>
-                          <a:blip r:embed="rId84"/>
+                          <a:blip r:embed="rId88"/>
                           <a:stretch>
                             <a:fillRect/>
                           </a:stretch>
@@ -8139,8 +8296,8 @@
         <w:t xml:space="preserve">= + ∞ means some evacuees are cut off from their shelters.</w:t>
       </w:r>
     </w:p>
-    <w:bookmarkEnd w:id="87"/>
-    <w:bookmarkStart w:id="91" w:name="where-to-build-ligtas-pinoy-centers"/>
+    <w:bookmarkEnd w:id="91"/>
+    <w:bookmarkStart w:id="95" w:name="where-to-build-ligtas-pinoy-centers"/>
     <w:p>
       <w:pPr>
         <w:pStyle w:val="Heading2"/>
@@ -8453,18 +8610,18 @@
                 <wp:inline>
                   <wp:extent cx="1670608" cy="152427"/>
                   <wp:effectExtent b="0" l="0" r="0" t="0"/>
-                  <wp:docPr descr="" title="" id="89" name="Picture"/>
+                  <wp:docPr descr="" title="" id="93" name="Picture"/>
                   <a:graphic>
                     <a:graphicData uri="http://schemas.openxmlformats.org/drawingml/2006/picture">
                       <pic:pic>
                         <pic:nvPicPr>
-                          <pic:cNvPr descr="/home/user/MAP---A/research/safe-shelter-open-schools/paper/eq/eq_5bd7cad120ca6a43.png" id="90" name="Picture"/>
+                          <pic:cNvPr descr="/home/user/MAP---A/research/safe-shelter-open-schools/paper/eq/eq_5bd7cad120ca6a43.png" id="94" name="Picture"/>
                           <pic:cNvPicPr>
                             <a:picLocks noChangeArrowheads="1" noChangeAspect="1"/>
                           </pic:cNvPicPr>
                         </pic:nvPicPr>
                         <pic:blipFill>
-                          <a:blip r:embed="rId88"/>
+                          <a:blip r:embed="rId92"/>
                           <a:stretch>
                             <a:fillRect/>
                           </a:stretch>
@@ -8687,8 +8844,8 @@
         <w:t xml:space="preserve"> 6  return S</w:t>
       </w:r>
     </w:p>
-    <w:bookmarkEnd w:id="91"/>
-    <w:bookmarkStart w:id="92" w:name="baselines"/>
+    <w:bookmarkEnd w:id="95"/>
+    <w:bookmarkStart w:id="96" w:name="baselines"/>
     <w:p>
       <w:pPr>
         <w:pStyle w:val="Heading2"/>
@@ -8792,8 +8949,8 @@
         <w:t xml:space="preserve">= 0: it shelters as many people as possible, vulnerable residents first, and then minimizes travel alone, using classrooms whenever they are nearer.</w:t>
       </w:r>
     </w:p>
-    <w:bookmarkEnd w:id="92"/>
-    <w:bookmarkStart w:id="93" w:name="assumptions"/>
+    <w:bookmarkEnd w:id="96"/>
+    <w:bookmarkStart w:id="97" w:name="assumptions"/>
     <w:p>
       <w:pPr>
         <w:pStyle w:val="Heading2"/>
@@ -8806,7 +8963,7 @@
       <w:pPr>
         <w:numPr>
           <w:ilvl w:val="0"/>
-          <w:numId w:val="1004"/>
+          <w:numId w:val="1005"/>
         </w:numPr>
         <w:pStyle w:val="Compact"/>
       </w:pPr>
@@ -8828,7 +8985,7 @@
       <w:pPr>
         <w:numPr>
           <w:ilvl w:val="0"/>
-          <w:numId w:val="1004"/>
+          <w:numId w:val="1005"/>
         </w:numPr>
         <w:pStyle w:val="Compact"/>
       </w:pPr>
@@ -8874,7 +9031,7 @@
       <w:pPr>
         <w:numPr>
           <w:ilvl w:val="0"/>
-          <w:numId w:val="1004"/>
+          <w:numId w:val="1005"/>
         </w:numPr>
         <w:pStyle w:val="Compact"/>
       </w:pPr>
@@ -8896,7 +9053,7 @@
       <w:pPr>
         <w:numPr>
           <w:ilvl w:val="0"/>
-          <w:numId w:val="1004"/>
+          <w:numId w:val="1005"/>
         </w:numPr>
         <w:pStyle w:val="Compact"/>
       </w:pPr>
@@ -8918,7 +9075,7 @@
       <w:pPr>
         <w:numPr>
           <w:ilvl w:val="0"/>
-          <w:numId w:val="1004"/>
+          <w:numId w:val="1005"/>
         </w:numPr>
         <w:pStyle w:val="Compact"/>
       </w:pPr>
@@ -8940,7 +9097,7 @@
       <w:pPr>
         <w:numPr>
           <w:ilvl w:val="0"/>
-          <w:numId w:val="1004"/>
+          <w:numId w:val="1005"/>
         </w:numPr>
         <w:pStyle w:val="Compact"/>
       </w:pPr>
@@ -8962,7 +9119,7 @@
       <w:pPr>
         <w:numPr>
           <w:ilvl w:val="0"/>
-          <w:numId w:val="1004"/>
+          <w:numId w:val="1005"/>
         </w:numPr>
         <w:pStyle w:val="Compact"/>
       </w:pPr>
@@ -8980,8 +9137,8 @@
         <w:t xml:space="preserve">A shelter outside every active zone is safe for the length of the stay; ashfall, which may close schools outside the danger zones, is not modeled.</w:t>
       </w:r>
     </w:p>
-    <w:bookmarkEnd w:id="93"/>
-    <w:bookmarkStart w:id="94" w:name="notation"/>
+    <w:bookmarkEnd w:id="97"/>
+    <w:bookmarkStart w:id="98" w:name="notation"/>
     <w:p>
       <w:pPr>
         <w:pStyle w:val="Heading2"/>
@@ -10456,9 +10613,9 @@
         <w:t xml:space="preserve">Equation (3) applies the Sphere indicator and the DepEd classroom standard; Equation (6) is the classic transportation problem; Definition 10 is the time-expanded network of Ford and Fulkerson (1962); Equation (11) follows Jenelius et al. (2006); and Equation (12) follows Church and ReVelle (1974). All remaining equations are original to this study.</w:t>
       </w:r>
     </w:p>
-    <w:bookmarkEnd w:id="94"/>
-    <w:bookmarkEnd w:id="95"/>
-    <w:bookmarkStart w:id="135" w:name="findings"/>
+    <w:bookmarkEnd w:id="98"/>
+    <w:bookmarkEnd w:id="99"/>
+    <w:bookmarkStart w:id="139" w:name="findings"/>
     <w:p>
       <w:pPr>
         <w:pStyle w:val="Heading1"/>
@@ -10467,7 +10624,7 @@
         <w:t xml:space="preserve">3. FINDINGS</w:t>
       </w:r>
     </w:p>
-    <w:bookmarkStart w:id="96" w:name="X018a8d5dc2e43d5c2963eb82bf885375afb469b"/>
+    <w:bookmarkStart w:id="100" w:name="X018a8d5dc2e43d5c2963eb82bf885375afb469b"/>
     <w:p>
       <w:pPr>
         <w:pStyle w:val="Heading2"/>
@@ -10523,8 +10680,8 @@
         <w:t xml:space="preserve">(Appendix F). No number in this chapter describes a real shelter, school, road, or barangay of Albay; the worked instance is a synthetic volcano built to exercise every part of the pipeline.</w:t>
       </w:r>
     </w:p>
-    <w:bookmarkEnd w:id="96"/>
-    <w:bookmarkStart w:id="97" w:name="general-methods"/>
+    <w:bookmarkEnd w:id="100"/>
+    <w:bookmarkStart w:id="101" w:name="general-methods"/>
     <w:p>
       <w:pPr>
         <w:pStyle w:val="Heading2"/>
@@ -10685,8 +10842,8 @@
         <w:t xml:space="preserve">Every proven property was checked against reference code on random synthetic instances (Section 3.3), and the running time was measured (Section 3.4).</w:t>
       </w:r>
     </w:p>
-    <w:bookmarkEnd w:id="97"/>
-    <w:bookmarkStart w:id="116" w:name="theoretical-results"/>
+    <w:bookmarkEnd w:id="101"/>
+    <w:bookmarkStart w:id="120" w:name="theoretical-results"/>
     <w:p>
       <w:pPr>
         <w:pStyle w:val="Heading2"/>
@@ -11746,18 +11903,18 @@
                 <wp:inline>
                   <wp:extent cx="3934663" cy="155435"/>
                   <wp:effectExtent b="0" l="0" r="0" t="0"/>
-                  <wp:docPr descr="" title="" id="99" name="Picture"/>
+                  <wp:docPr descr="" title="" id="103" name="Picture"/>
                   <a:graphic>
                     <a:graphicData uri="http://schemas.openxmlformats.org/drawingml/2006/picture">
                       <pic:pic>
                         <pic:nvPicPr>
-                          <pic:cNvPr descr="/home/user/MAP---A/research/safe-shelter-open-schools/paper/eq/eq_ba61f184c1929915.png" id="100" name="Picture"/>
+                          <pic:cNvPr descr="/home/user/MAP---A/research/safe-shelter-open-schools/paper/eq/eq_ba61f184c1929915.png" id="104" name="Picture"/>
                           <pic:cNvPicPr>
                             <a:picLocks noChangeArrowheads="1" noChangeAspect="1"/>
                           </pic:cNvPicPr>
                         </pic:nvPicPr>
                         <pic:blipFill>
-                          <a:blip r:embed="rId98"/>
+                          <a:blip r:embed="rId102"/>
                           <a:stretch>
                             <a:fillRect/>
                           </a:stretch>
@@ -12182,18 +12339,18 @@
                 <wp:inline>
                   <wp:extent cx="2932480" cy="347508"/>
                   <wp:effectExtent b="0" l="0" r="0" t="0"/>
-                  <wp:docPr descr="" title="" id="102" name="Picture"/>
+                  <wp:docPr descr="" title="" id="106" name="Picture"/>
                   <a:graphic>
                     <a:graphicData uri="http://schemas.openxmlformats.org/drawingml/2006/picture">
                       <pic:pic>
                         <pic:nvPicPr>
-                          <pic:cNvPr descr="/home/user/MAP---A/research/safe-shelter-open-schools/paper/eq/eq_5b0c553bff1dd7f5.png" id="103" name="Picture"/>
+                          <pic:cNvPr descr="/home/user/MAP---A/research/safe-shelter-open-schools/paper/eq/eq_5b0c553bff1dd7f5.png" id="107" name="Picture"/>
                           <pic:cNvPicPr>
                             <a:picLocks noChangeArrowheads="1" noChangeAspect="1"/>
                           </pic:cNvPicPr>
                         </pic:nvPicPr>
                         <pic:blipFill>
-                          <a:blip r:embed="rId101"/>
+                          <a:blip r:embed="rId105"/>
                           <a:stretch>
                             <a:fillRect/>
                           </a:stretch>
@@ -13148,18 +13305,18 @@
                 <wp:inline>
                   <wp:extent cx="2182672" cy="320084"/>
                   <wp:effectExtent b="0" l="0" r="0" t="0"/>
-                  <wp:docPr descr="" title="" id="105" name="Picture"/>
+                  <wp:docPr descr="" title="" id="109" name="Picture"/>
                   <a:graphic>
                     <a:graphicData uri="http://schemas.openxmlformats.org/drawingml/2006/picture">
                       <pic:pic>
                         <pic:nvPicPr>
-                          <pic:cNvPr descr="/home/user/MAP---A/research/safe-shelter-open-schools/paper/eq/eq_cea02a7507dc9f1f.png" id="106" name="Picture"/>
+                          <pic:cNvPr descr="/home/user/MAP---A/research/safe-shelter-open-schools/paper/eq/eq_cea02a7507dc9f1f.png" id="110" name="Picture"/>
                           <pic:cNvPicPr>
                             <a:picLocks noChangeArrowheads="1" noChangeAspect="1"/>
                           </pic:cNvPicPr>
                         </pic:nvPicPr>
                         <pic:blipFill>
-                          <a:blip r:embed="rId104"/>
+                          <a:blip r:embed="rId108"/>
                           <a:stretch>
                             <a:fillRect/>
                           </a:stretch>
@@ -14301,18 +14458,18 @@
                 <wp:inline>
                   <wp:extent cx="3026664" cy="329184"/>
                   <wp:effectExtent b="0" l="0" r="0" t="0"/>
-                  <wp:docPr descr="" title="" id="108" name="Picture"/>
+                  <wp:docPr descr="" title="" id="112" name="Picture"/>
                   <a:graphic>
                     <a:graphicData uri="http://schemas.openxmlformats.org/drawingml/2006/picture">
                       <pic:pic>
                         <pic:nvPicPr>
-                          <pic:cNvPr descr="/home/user/MAP---A/research/safe-shelter-open-schools/paper/eq/eq_b03a5e7552486e20.png" id="109" name="Picture"/>
+                          <pic:cNvPr descr="/home/user/MAP---A/research/safe-shelter-open-schools/paper/eq/eq_b03a5e7552486e20.png" id="113" name="Picture"/>
                           <pic:cNvPicPr>
                             <a:picLocks noChangeArrowheads="1" noChangeAspect="1"/>
                           </pic:cNvPicPr>
                         </pic:nvPicPr>
                         <pic:blipFill>
-                          <a:blip r:embed="rId107"/>
+                          <a:blip r:embed="rId111"/>
                           <a:stretch>
                             <a:fillRect/>
                           </a:stretch>
@@ -14973,7 +15130,7 @@
       <w:pPr>
         <w:numPr>
           <w:ilvl w:val="0"/>
-          <w:numId w:val="1005"/>
+          <w:numId w:val="1006"/>
         </w:numPr>
       </w:pPr>
       <w:r>
@@ -15191,7 +15348,7 @@
       <w:pPr>
         <w:numPr>
           <w:ilvl w:val="0"/>
-          <w:numId w:val="1005"/>
+          <w:numId w:val="1006"/>
         </w:numPr>
       </w:pPr>
       <w:r>
@@ -15642,18 +15799,18 @@
                 <wp:inline>
                   <wp:extent cx="4212640" cy="317014"/>
                   <wp:effectExtent b="0" l="0" r="0" t="0"/>
-                  <wp:docPr descr="" title="" id="111" name="Picture"/>
+                  <wp:docPr descr="" title="" id="115" name="Picture"/>
                   <a:graphic>
                     <a:graphicData uri="http://schemas.openxmlformats.org/drawingml/2006/picture">
                       <pic:pic>
                         <pic:nvPicPr>
-                          <pic:cNvPr descr="/home/user/MAP---A/research/safe-shelter-open-schools/paper/eq/eq_4b75c64ddf08008c.png" id="112" name="Picture"/>
+                          <pic:cNvPr descr="/home/user/MAP---A/research/safe-shelter-open-schools/paper/eq/eq_4b75c64ddf08008c.png" id="116" name="Picture"/>
                           <pic:cNvPicPr>
                             <a:picLocks noChangeArrowheads="1" noChangeAspect="1"/>
                           </pic:cNvPicPr>
                         </pic:nvPicPr>
                         <pic:blipFill>
-                          <a:blip r:embed="rId110"/>
+                          <a:blip r:embed="rId114"/>
                           <a:stretch>
                             <a:fillRect/>
                           </a:stretch>
@@ -15974,18 +16131,18 @@
                 <wp:inline>
                   <wp:extent cx="2386584" cy="295655"/>
                   <wp:effectExtent b="0" l="0" r="0" t="0"/>
-                  <wp:docPr descr="" title="" id="114" name="Picture"/>
+                  <wp:docPr descr="" title="" id="118" name="Picture"/>
                   <a:graphic>
                     <a:graphicData uri="http://schemas.openxmlformats.org/drawingml/2006/picture">
                       <pic:pic>
                         <pic:nvPicPr>
-                          <pic:cNvPr descr="/home/user/MAP---A/research/safe-shelter-open-schools/paper/eq/eq_06613d1a53b2ea53.png" id="115" name="Picture"/>
+                          <pic:cNvPr descr="/home/user/MAP---A/research/safe-shelter-open-schools/paper/eq/eq_06613d1a53b2ea53.png" id="119" name="Picture"/>
                           <pic:cNvPicPr>
                             <a:picLocks noChangeArrowheads="1" noChangeAspect="1"/>
                           </pic:cNvPicPr>
                         </pic:nvPicPr>
                         <pic:blipFill>
-                          <a:blip r:embed="rId113"/>
+                          <a:blip r:embed="rId117"/>
                           <a:stretch>
                             <a:fillRect/>
                           </a:stretch>
@@ -16234,8 +16391,8 @@
         <w:t xml:space="preserve">By Proposition 10, a provincial planner may pick Ligtas Pinoy Center sites by a rule that fits in a spreadsheet, and the coverage obtained is guaranteed to reach 63.2 percent or more of the optimum. In practice the greedy rule beat this guarantee by a wide margin in the tests of Section 3.3.</w:t>
       </w:r>
     </w:p>
-    <w:bookmarkEnd w:id="116"/>
-    <w:bookmarkStart w:id="117" w:name="software-verification"/>
+    <w:bookmarkEnd w:id="120"/>
+    <w:bookmarkStart w:id="121" w:name="software-verification"/>
     <w:p>
       <w:pPr>
         <w:pStyle w:val="Heading2"/>
@@ -16741,8 +16898,8 @@
         <w:t xml:space="preserve">Two rows deserve comment. The packing row shows that the bound of Proposition 4 is not merely safe but nearly tight in practice: in the 6 instances where packing missed the exact minimum, the exact program regrouped evacuees between schools so that each school filled whole rooms. The clearance row shows the value of bisection: on the same instances, a minute-by-minute scan needed about five times as many maximum-flow computations.</w:t>
       </w:r>
     </w:p>
-    <w:bookmarkEnd w:id="117"/>
-    <w:bookmarkStart w:id="118" w:name="computational-cost"/>
+    <w:bookmarkEnd w:id="121"/>
+    <w:bookmarkStart w:id="122" w:name="computational-cost"/>
     <w:p>
       <w:pPr>
         <w:pStyle w:val="Heading2"/>
@@ -17533,8 +17690,8 @@
         <w:t xml:space="preserve">Albay has 720 barangays, and the largest row of Table 8, with 160 origin clusters and 120 shelters, already exceeds the evacuation of the whole Permanent and Extended Danger Zones of Mayon. The time-expanded network grows linearly with the horizon, as Proposition 7 predicts, and a clearance time of four hours costs about half a second per maximum flow, or a few seconds for the whole bisection.</w:t>
       </w:r>
     </w:p>
-    <w:bookmarkEnd w:id="118"/>
-    <w:bookmarkStart w:id="129" w:name="worked-instance-e1"/>
+    <w:bookmarkEnd w:id="122"/>
+    <w:bookmarkStart w:id="133" w:name="worked-instance-e1"/>
     <w:p>
       <w:pPr>
         <w:pStyle w:val="Heading2"/>
@@ -17560,18 +17717,18 @@
           <wp:inline>
             <wp:extent cx="4754880" cy="4457700"/>
             <wp:effectExtent b="0" l="0" r="0" t="0"/>
-            <wp:docPr descr="" title="" id="120" name="Picture"/>
+            <wp:docPr descr="" title="" id="124" name="Picture"/>
             <a:graphic>
               <a:graphicData uri="http://schemas.openxmlformats.org/drawingml/2006/picture">
                 <pic:pic>
                   <pic:nvPicPr>
-                    <pic:cNvPr descr="/home/user/MAP---A/research/safe-shelter-open-schools/paper/../code/figures/fig_e1_map.png" id="121" name="Picture"/>
+                    <pic:cNvPr descr="/home/user/MAP---A/research/safe-shelter-open-schools/paper/../code/figures/fig_e1_map.png" id="125" name="Picture"/>
                     <pic:cNvPicPr>
                       <a:picLocks noChangeArrowheads="1" noChangeAspect="1"/>
                     </pic:cNvPicPr>
                   </pic:nvPicPr>
                   <pic:blipFill>
-                    <a:blip r:embed="rId119"/>
+                    <a:blip r:embed="rId123"/>
                     <a:stretch>
                       <a:fillRect/>
                     </a:stretch>
@@ -19098,7 +19255,7 @@
         <w:t xml:space="preserve">The non-school shelters hold 900 persons, the school open spaces 420, and the 64 classrooms 1,152, for 2,472 in all. SCH3 is a two-storey school without a ramp, so vulnerable evacuees may not be placed there.</w:t>
       </w:r>
     </w:p>
-    <w:bookmarkStart w:id="122" w:name="shelter-plans-on-e1"/>
+    <w:bookmarkStart w:id="126" w:name="shelter-plans-on-e1"/>
     <w:p>
       <w:pPr>
         <w:pStyle w:val="Heading3"/>
@@ -20587,8 +20744,8 @@
         <w:t xml:space="preserve">= 1, no plan that shelters everyone could close fewer.</w:t>
       </w:r>
     </w:p>
-    <w:bookmarkEnd w:id="122"/>
-    <w:bookmarkStart w:id="123" w:name="classrooms-and-learners"/>
+    <w:bookmarkEnd w:id="126"/>
+    <w:bookmarkStart w:id="127" w:name="classrooms-and-learners"/>
     <w:p>
       <w:pPr>
         <w:pStyle w:val="Heading3"/>
@@ -20605,8 +20762,8 @@
         <w:t xml:space="preserve">The classroom count turns into lost schooling. With the average class sizes of Table 11, the time-only plan at Alert Level 3 displaces 1,702 learners and the school-preserving plan 532. If the stay lasts the fifteen days that DepEd guidance allows for medium- and long-term displacement, the difference is 17,550 learner-days of face-to-face classes kept, or 390 classroom-days.</w:t>
       </w:r>
     </w:p>
-    <w:bookmarkEnd w:id="123"/>
-    <w:bookmarkStart w:id="127" w:name="X6649bc74bad9d91ac55ee910012bd018b6f66d1"/>
+    <w:bookmarkEnd w:id="127"/>
+    <w:bookmarkStart w:id="131" w:name="X6649bc74bad9d91ac55ee910012bd018b6f66d1"/>
     <w:p>
       <w:pPr>
         <w:pStyle w:val="Heading3"/>
@@ -21000,18 +21157,18 @@
           <wp:inline>
             <wp:extent cx="5120640" cy="2880360"/>
             <wp:effectExtent b="0" l="0" r="0" t="0"/>
-            <wp:docPr descr="" title="" id="125" name="Picture"/>
+            <wp:docPr descr="" title="" id="129" name="Picture"/>
             <a:graphic>
               <a:graphicData uri="http://schemas.openxmlformats.org/drawingml/2006/picture">
                 <pic:pic>
                   <pic:nvPicPr>
-                    <pic:cNvPr descr="/home/user/MAP---A/research/safe-shelter-open-schools/paper/../code/figures/fig_e1_arrivals.png" id="126" name="Picture"/>
+                    <pic:cNvPr descr="/home/user/MAP---A/research/safe-shelter-open-schools/paper/../code/figures/fig_e1_arrivals.png" id="130" name="Picture"/>
                     <pic:cNvPicPr>
                       <a:picLocks noChangeArrowheads="1" noChangeAspect="1"/>
                     </pic:cNvPicPr>
                   </pic:nvPicPr>
                   <pic:blipFill>
-                    <a:blip r:embed="rId124"/>
+                    <a:blip r:embed="rId128"/>
                     <a:stretch>
                       <a:fillRect/>
                     </a:stretch>
@@ -21546,8 +21703,8 @@
         <w:t xml:space="preserve">Closed one at a time, the seven bridges barely matter: six leave the clearance time at 53 minutes and the seventh, A4, adds one minute. The network has alternatives for every single crossing. A lahar, however, closes all the bridges over its channel at once. Losing channel A adds 42 minutes, and losing channel B adds 21. Losing both cuts the southern pocket, the ring between the two channels with O3, O4, and the central school SCH1, from every other shelter: 450 residents can no longer be sheltered at all, and the plan held fixed can never finish. The model therefore gives a concrete warning that no single-bridge analysis would give: O3 and O4 must be evacuated before lahar-producing rain, or the pocket needs a shelter of its own.</w:t>
       </w:r>
     </w:p>
-    <w:bookmarkEnd w:id="127"/>
-    <w:bookmarkStart w:id="128" w:name="X24754d921566be2e9da953a729aaaa468042402"/>
+    <w:bookmarkEnd w:id="131"/>
+    <w:bookmarkStart w:id="132" w:name="X24754d921566be2e9da953a729aaaa468042402"/>
     <w:p>
       <w:pPr>
         <w:pStyle w:val="Heading3"/>
@@ -22353,9 +22510,9 @@
         <w:t xml:space="preserve">. Its first choice, the south town, is inside the cut-off pocket, and it shelters 400 of the 450 residents who had nowhere to go. The second and third choices cut the persons in classrooms from 920 to 570 and then 360, closing 32 and then 20 classrooms instead of 52. The southeast city gains nothing: its existing shelters already cover everyone who can reach it within half an hour.</w:t>
       </w:r>
     </w:p>
-    <w:bookmarkEnd w:id="128"/>
-    <w:bookmarkEnd w:id="129"/>
-    <w:bookmarkStart w:id="134" w:name="X7ad5731e4de5fee592e29e74482de2cc1cd5d38"/>
+    <w:bookmarkEnd w:id="132"/>
+    <w:bookmarkEnd w:id="133"/>
+    <w:bookmarkStart w:id="138" w:name="X7ad5731e4de5fee592e29e74482de2cc1cd5d38"/>
     <w:p>
       <w:pPr>
         <w:pStyle w:val="Heading2"/>
@@ -22372,7 +22529,7 @@
         <w:t xml:space="preserve">The experiments below use the Albay data set assembled in Stages 1 to 4 from the registers of Appendix A, along with randomized versions of that data set. Their results will appear in a separate report; every test and decision rule that follows was settled before the instance was run.</w:t>
       </w:r>
     </w:p>
-    <w:bookmarkStart w:id="130" w:name="sensitivity-analysis"/>
+    <w:bookmarkStart w:id="134" w:name="sensitivity-analysis"/>
     <w:p>
       <w:pPr>
         <w:pStyle w:val="Heading3"/>
@@ -22411,8 +22568,8 @@
         <w:t xml:space="preserve">(60, 90, and 120 minutes), road capacities (± 25 and ± 50 percent), travel speeds (± 20 percent), and the share of vulnerable residents (± 5 percentage points). Every scenario of Table 4 is rerun under each setting.</w:t>
       </w:r>
     </w:p>
-    <w:bookmarkEnd w:id="130"/>
-    <w:bookmarkStart w:id="131" w:name="statistical-treatment"/>
+    <w:bookmarkEnd w:id="134"/>
+    <w:bookmarkStart w:id="135" w:name="statistical-treatment"/>
     <w:p>
       <w:pPr>
         <w:pStyle w:val="Heading3"/>
@@ -22918,8 +23075,8 @@
         </w:tc>
       </w:tr>
     </w:tbl>
-    <w:bookmarkEnd w:id="131"/>
-    <w:bookmarkStart w:id="132" w:name="model-hypotheses-fixed-in-advance"/>
+    <w:bookmarkEnd w:id="135"/>
+    <w:bookmarkStart w:id="136" w:name="model-hypotheses-fixed-in-advance"/>
     <w:p>
       <w:pPr>
         <w:pStyle w:val="Heading3"/>
@@ -22934,513 +23091,6 @@
       </w:pPr>
       <w:r>
         <w:t xml:space="preserve">Each hypothesis below, with its rule for deciding support, was stated before any computation on the study-area instance.</w:t>
-      </w:r>
-    </w:p>
-    <w:p>
-      <w:pPr>
-        <w:numPr>
-          <w:ilvl w:val="0"/>
-          <w:numId w:val="1006"/>
-        </w:numPr>
-        <w:pStyle w:val="Compact"/>
-      </w:pPr>
-      <w:r>
-        <w:rPr>
-          <w:bCs/>
-          <w:b/>
-        </w:rPr>
-        <w:t xml:space="preserve">M1.</w:t>
-      </w:r>
-      <w:r>
-        <w:t xml:space="preserve"> </w:t>
-      </w:r>
-      <w:r>
-        <w:t xml:space="preserve">At Alert Level 3, the school-preserving plan closes fewer than half the classrooms of the time-only plan. Supported if the bootstrap interval of the ratio lies wholly below 0.5.</w:t>
-      </w:r>
-    </w:p>
-    <w:p>
-      <w:pPr>
-        <w:numPr>
-          <w:ilvl w:val="0"/>
-          <w:numId w:val="1006"/>
-        </w:numPr>
-        <w:pStyle w:val="Compact"/>
-      </w:pPr>
-      <w:r>
-        <w:rPr>
-          <w:bCs/>
-          <w:b/>
-        </w:rPr>
-        <w:t xml:space="preserve">M2.</w:t>
-      </w:r>
-      <w:r>
-        <w:t xml:space="preserve"> </w:t>
-      </w:r>
-      <w:r>
-        <w:t xml:space="preserve">The extra mean travel time of the school-preserving plan is below ten minutes per evacuee. Supported if the whole bootstrap interval falls under 10.</w:t>
-      </w:r>
-    </w:p>
-    <w:p>
-      <w:pPr>
-        <w:numPr>
-          <w:ilvl w:val="0"/>
-          <w:numId w:val="1006"/>
-        </w:numPr>
-        <w:pStyle w:val="Compact"/>
-      </w:pPr>
-      <w:r>
-        <w:rPr>
-          <w:bCs/>
-          <w:b/>
-        </w:rPr>
-        <w:t xml:space="preserve">M3.</w:t>
-      </w:r>
-      <w:r>
-        <w:t xml:space="preserve"> </w:t>
-      </w:r>
-      <w:r>
-        <w:t xml:space="preserve">The nearest-site rule overfills at least one shelter in every scenario. Supported if the overflow is positive in all scenarios of Table 4.</w:t>
-      </w:r>
-    </w:p>
-    <w:p>
-      <w:pPr>
-        <w:numPr>
-          <w:ilvl w:val="0"/>
-          <w:numId w:val="1006"/>
-        </w:numPr>
-        <w:pStyle w:val="Compact"/>
-      </w:pPr>
-      <w:r>
-        <w:rPr>
-          <w:bCs/>
-          <w:b/>
-        </w:rPr>
-        <w:t xml:space="preserve">M4.</w:t>
-      </w:r>
-      <w:r>
-        <w:t xml:space="preserve"> </w:t>
-      </w:r>
-      <w:r>
-        <w:t xml:space="preserve">Larger alert levels never free classrooms and closures never shorten the evacuation. Propositions 5 and 9 guarantee this exactly; any violation would therefore signal a data error, and the record would go back for checking.</w:t>
-      </w:r>
-    </w:p>
-    <w:p>
-      <w:pPr>
-        <w:numPr>
-          <w:ilvl w:val="0"/>
-          <w:numId w:val="1006"/>
-        </w:numPr>
-        <w:pStyle w:val="Compact"/>
-      </w:pPr>
-      <w:r>
-        <w:rPr>
-          <w:bCs/>
-          <w:b/>
-        </w:rPr>
-        <w:t xml:space="preserve">M5.</w:t>
-      </w:r>
-      <w:r>
-        <w:t xml:space="preserve"> </w:t>
-      </w:r>
-      <w:r>
-        <w:t xml:space="preserve">In the compound scenario, at least one barangay cluster is cut off from every shelter outside its pocket. Supported if the list of trapped origins is not empty; the list is then reported to the PDRRMO.</w:t>
-      </w:r>
-    </w:p>
-    <w:p>
-      <w:pPr>
-        <w:numPr>
-          <w:ilvl w:val="0"/>
-          <w:numId w:val="1006"/>
-        </w:numPr>
-        <w:pStyle w:val="Compact"/>
-      </w:pPr>
-      <w:r>
-        <w:rPr>
-          <w:bCs/>
-          <w:b/>
-        </w:rPr>
-        <w:t xml:space="preserve">M6.</w:t>
-      </w:r>
-      <w:r>
-        <w:t xml:space="preserve"> </w:t>
-      </w:r>
-      <w:r>
-        <w:t xml:space="preserve">Two Ligtas Pinoy Centers placed by Algorithm 3 cut the persons housed in classrooms at Alert Level 4 by at least 30 percent.</w:t>
-      </w:r>
-    </w:p>
-    <w:p>
-      <w:pPr>
-        <w:numPr>
-          <w:ilvl w:val="0"/>
-          <w:numId w:val="1006"/>
-        </w:numPr>
-        <w:pStyle w:val="Compact"/>
-      </w:pPr>
-      <w:r>
-        <w:rPr>
-          <w:bCs/>
-          <w:b/>
-        </w:rPr>
-        <w:t xml:space="preserve">M7.</w:t>
-      </w:r>
-      <w:r>
-        <w:t xml:space="preserve"> </w:t>
-      </w:r>
-      <w:r>
-        <w:t xml:space="preserve">Every vulnerable resident can be placed in an accessible shelter at Alert Level 3. Supported if</w:t>
-      </w:r>
-      <w:r>
-        <w:t xml:space="preserve"> </w:t>
-      </w:r>
-      <w:r>
-        <w:rPr>
-          <w:iCs/>
-          <w:i/>
-        </w:rPr>
-        <w:t xml:space="preserve">F</w:t>
-      </w:r>
-      <w:r>
-        <w:rPr>
-          <w:iCs/>
-          <w:i/>
-          <w:vertAlign w:val="subscript"/>
-        </w:rPr>
-        <w:t xml:space="preserve">V</w:t>
-      </w:r>
-      <w:r>
-        <w:rPr>
-          <w:vertAlign w:val="superscript"/>
-        </w:rPr>
-        <w:t xml:space="preserve">*</w:t>
-      </w:r>
-      <w:r>
-        <w:t xml:space="preserve"> </w:t>
-      </w:r>
-      <w:r>
-        <w:t xml:space="preserve">=</w:t>
-      </w:r>
-      <w:r>
-        <w:t xml:space="preserve"> </w:t>
-      </w:r>
-      <w:r>
-        <w:rPr>
-          <w:iCs/>
-          <w:i/>
-        </w:rPr>
-        <w:t xml:space="preserve">V</w:t>
-      </w:r>
-      <w:r>
-        <w:t xml:space="preserve">(</w:t>
-      </w:r>
-      <w:r>
-        <w:rPr>
-          <w:iCs/>
-          <w:i/>
-        </w:rPr>
-        <w:t xml:space="preserve">σ</w:t>
-      </w:r>
-      <w:r>
-        <w:t xml:space="preserve">); otherwise the deficit is reported by municipality.</w:t>
-      </w:r>
-    </w:p>
-    <w:p>
-      <w:pPr>
-        <w:numPr>
-          <w:ilvl w:val="0"/>
-          <w:numId w:val="1006"/>
-        </w:numPr>
-        <w:pStyle w:val="Compact"/>
-      </w:pPr>
-      <w:r>
-        <w:rPr>
-          <w:bCs/>
-          <w:b/>
-        </w:rPr>
-        <w:t xml:space="preserve">M8.</w:t>
-      </w:r>
-      <w:r>
-        <w:t xml:space="preserve"> </w:t>
-      </w:r>
-      <w:r>
-        <w:t xml:space="preserve">The ranking of municipalities by classrooms closed is stable under the space standard: Spearman’s</w:t>
-      </w:r>
-      <w:r>
-        <w:t xml:space="preserve"> </w:t>
-      </w:r>
-      <w:r>
-        <w:rPr>
-          <w:iCs/>
-          <w:i/>
-        </w:rPr>
-        <w:t xml:space="preserve">ρ</w:t>
-      </w:r>
-      <w:r>
-        <w:t xml:space="preserve"> </w:t>
-      </w:r>
-      <w:r>
-        <w:t xml:space="preserve">above 0.8.</w:t>
-      </w:r>
-    </w:p>
-    <w:p>
-      <w:pPr>
-        <w:pStyle w:val="FirstParagraph"/>
-      </w:pPr>
-      <w:r>
-        <w:t xml:space="preserve">Within the model, M1, M2, and M6 measure the trade-offs relevant to targets 4.a and 11.5.</w:t>
-      </w:r>
-    </w:p>
-    <w:bookmarkEnd w:id="132"/>
-    <w:bookmarkStart w:id="133" w:name="sensitivity-sweeps"/>
-    <w:p>
-      <w:pPr>
-        <w:pStyle w:val="Heading3"/>
-      </w:pPr>
-      <w:r>
-        <w:t xml:space="preserve">3.6.4 Sensitivity Sweeps</w:t>
-      </w:r>
-    </w:p>
-    <w:p>
-      <w:pPr>
-        <w:pStyle w:val="FirstParagraph"/>
-      </w:pPr>
-      <w:r>
-        <w:t xml:space="preserve">Across seven sweeps, the main results are recomputed over a range of one parameter at a time: the space standard, the classroom capacity,</w:t>
-      </w:r>
-      <w:r>
-        <w:t xml:space="preserve"> </w:t>
-      </w:r>
-      <w:r>
-        <w:rPr>
-          <w:iCs/>
-          <w:i/>
-        </w:rPr>
-        <w:t xml:space="preserve">θ</w:t>
-      </w:r>
-      <w:r>
-        <w:rPr>
-          <w:vertAlign w:val="subscript"/>
-        </w:rPr>
-        <w:t xml:space="preserve">max</w:t>
-      </w:r>
-      <w:r>
-        <w:t xml:space="preserve">, road capacities, travel speeds, the vulnerable share, and the travel-time standard</w:t>
-      </w:r>
-      <w:r>
-        <w:t xml:space="preserve"> </w:t>
-      </w:r>
-      <w:r>
-        <w:rPr>
-          <w:iCs/>
-          <w:i/>
-        </w:rPr>
-        <w:t xml:space="preserve">θ</w:t>
-      </w:r>
-      <w:r>
-        <w:t xml:space="preserve"> </w:t>
-      </w:r>
-      <w:r>
-        <w:t xml:space="preserve">of the siting problem (15, 30, and 45 minutes).</w:t>
-      </w:r>
-    </w:p>
-    <w:bookmarkEnd w:id="133"/>
-    <w:bookmarkEnd w:id="134"/>
-    <w:bookmarkEnd w:id="135"/>
-    <w:bookmarkStart w:id="140" w:name="conclusions"/>
-    <w:p>
-      <w:pPr>
-        <w:pStyle w:val="Heading1"/>
-      </w:pPr>
-      <w:r>
-        <w:t xml:space="preserve">4. CONCLUSIONS</w:t>
-      </w:r>
-    </w:p>
-    <w:bookmarkStart w:id="136" w:name="evaluation-of-the-findings"/>
-    <w:p>
-      <w:pPr>
-        <w:pStyle w:val="Heading2"/>
-      </w:pPr>
-      <w:r>
-        <w:t xml:space="preserve">4.1 Evaluation of the Findings</w:t>
-      </w:r>
-    </w:p>
-    <w:p>
-      <w:pPr>
-        <w:pStyle w:val="FirstParagraph"/>
-      </w:pPr>
-      <w:r>
-        <w:t xml:space="preserve">This study set out to answer one main question. How can each evacuee from an Albay hazard zone receive a shelter so that vulnerable residents come first, everyone has a place, and the fewest classrooms close? The question also covered how much time such an evacuation would need. The findings show that such a plan can be stated precisely and solved exactly within seconds on a laptop. Separately written code confirms it, and it can be analyzed before any field survey.</w:t>
-      </w:r>
-    </w:p>
-    <w:p>
-      <w:pPr>
-        <w:pStyle w:val="BodyText"/>
-      </w:pPr>
-      <w:r>
-        <w:rPr>
-          <w:bCs/>
-          <w:b/>
-        </w:rPr>
-        <w:t xml:space="preserve">Objective 1: hazards, origins, roads, and shelters.</w:t>
-      </w:r>
-      <w:r>
-        <w:t xml:space="preserve"> </w:t>
-      </w:r>
-      <w:r>
-        <w:t xml:space="preserve">Scenarios, origins, the road network, and shelter capacities were defined from public registers and published standards (Definitions 1 to 6). A standard classroom holds 18 evacuees at the Sphere indicator, which turns the abstract rule</w:t>
-      </w:r>
-      <w:r>
-        <w:t xml:space="preserve"> </w:t>
-      </w:r>
-      <w:r>
-        <w:t xml:space="preserve">“</w:t>
-      </w:r>
-      <w:r>
-        <w:t xml:space="preserve">classrooms last</w:t>
-      </w:r>
-      <w:r>
-        <w:t xml:space="preserve">”</w:t>
-      </w:r>
-      <w:r>
-        <w:t xml:space="preserve"> </w:t>
-      </w:r>
-      <w:r>
-        <w:t xml:space="preserve">into a count that can be minimized.</w:t>
-      </w:r>
-    </w:p>
-    <w:p>
-      <w:pPr>
-        <w:pStyle w:val="BodyText"/>
-      </w:pPr>
-      <w:r>
-        <w:rPr>
-          <w:bCs/>
-          <w:b/>
-        </w:rPr>
-        <w:t xml:space="preserve">Objective 2: the lexicographic shelter plan.</w:t>
-      </w:r>
-      <w:r>
-        <w:t xml:space="preserve"> </w:t>
-      </w:r>
-      <w:r>
-        <w:t xml:space="preserve">The legal order of priorities became one minimum-cost flow. Plans are always in whole persons (Proposition 1), placing vulnerable residents first never costs anyone a place (Proposition 2), and the penalties reproduce the order exactly (Proposition 3). The plan matched five sequential linear programs at every level in all 300 test instances.</w:t>
-      </w:r>
-    </w:p>
-    <w:p>
-      <w:pPr>
-        <w:pStyle w:val="BodyText"/>
-      </w:pPr>
-      <w:r>
-        <w:rPr>
-          <w:bCs/>
-          <w:b/>
-        </w:rPr>
-        <w:t xml:space="preserve">Objective 3: classrooms and alert levels.</w:t>
-      </w:r>
-      <w:r>
-        <w:t xml:space="preserve"> </w:t>
-      </w:r>
-      <w:r>
-        <w:t xml:space="preserve">Packing evacuees into full classrooms closes at most one more classroom per school in use than the true minimum (Proposition 4); in 144 of 150 exact comparisons it closed none more. A higher alert level never frees classrooms (Proposition 5), which lets local governments plan once for the highest level.</w:t>
-      </w:r>
-    </w:p>
-    <w:p>
-      <w:pPr>
-        <w:pStyle w:val="BodyText"/>
-      </w:pPr>
-      <w:r>
-        <w:rPr>
-          <w:bCs/>
-          <w:b/>
-        </w:rPr>
-        <w:t xml:space="preserve">Objective 4: clearance time.</w:t>
-      </w:r>
-      <w:r>
-        <w:t xml:space="preserve"> </w:t>
-      </w:r>
-      <w:r>
-        <w:t xml:space="preserve">The time-expanded network gives the exact clearance time (Propositions 6 and 7) and agreed with the Ford-Fulkerson formula in all 660 tests; bisection found it with about five maximum-flow computations instead of about 27. The lower bound of Proposition 8 was never violated.</w:t>
-      </w:r>
-    </w:p>
-    <w:p>
-      <w:pPr>
-        <w:pStyle w:val="BodyText"/>
-      </w:pPr>
-      <w:r>
-        <w:rPr>
-          <w:bCs/>
-          <w:b/>
-        </w:rPr>
-        <w:t xml:space="preserve">Objective 5: closures and new shelters.</w:t>
-      </w:r>
-      <w:r>
-        <w:t xml:space="preserve"> </w:t>
-      </w:r>
-      <w:r>
-        <w:t xml:space="preserve">Closures never shorten an evacuation and new shelters never add classroom use when everyone is already sheltered (Proposition 9); no violation appeared in 463 checks. On E1, single bridges did not matter, but losing both lahar channels trapped 450 residents in a pocket served by one school.</w:t>
-      </w:r>
-    </w:p>
-    <w:p>
-      <w:pPr>
-        <w:pStyle w:val="BodyText"/>
-      </w:pPr>
-      <w:r>
-        <w:rPr>
-          <w:bCs/>
-          <w:b/>
-        </w:rPr>
-        <w:t xml:space="preserve">Objective 6: Ligtas Pinoy Center siting.</w:t>
-      </w:r>
-      <w:r>
-        <w:t xml:space="preserve"> </w:t>
-      </w:r>
-      <w:r>
-        <w:t xml:space="preserve">Because the extra coverage from new centers is submodular, greedy siting always attains no less than 63.2 percent of the optimum (Proposition 10). Across the test instances, greedy siting never dropped below 89.0 percent of the optimum and matched it exactly in 94.7 percent of them.</w:t>
-      </w:r>
-    </w:p>
-    <w:p>
-      <w:pPr>
-        <w:pStyle w:val="BodyText"/>
-      </w:pPr>
-      <w:r>
-        <w:rPr>
-          <w:bCs/>
-          <w:b/>
-        </w:rPr>
-        <w:t xml:space="preserve">Objective 7: verification.</w:t>
-      </w:r>
-      <w:r>
-        <w:t xml:space="preserve"> </w:t>
-      </w:r>
-      <w:r>
-        <w:t xml:space="preserve">Every proven property was checked against independently written code, and none failed (Table 7). Computing a plan for 160 origin clusters and 120 shelters took under three seconds in plain Python.</w:t>
-      </w:r>
-    </w:p>
-    <w:p>
-      <w:pPr>
-        <w:pStyle w:val="BodyText"/>
-      </w:pPr>
-      <w:r>
-        <w:rPr>
-          <w:bCs/>
-          <w:b/>
-        </w:rPr>
-        <w:t xml:space="preserve">Objective 8: worked instance and hypotheses.</w:t>
-      </w:r>
-      <w:r>
-        <w:t xml:space="preserve"> </w:t>
-      </w:r>
-      <w:r>
-        <w:t xml:space="preserve">The synthetic volcano makes the stakes concrete. At Alert Level 3 the school-preserving plan closed 14 classrooms instead of 40 and displaced 532 learners instead of 1,702, at a cost of 1.70 minutes of average travel; the nearest-site rule would have sent 298 people to full shelters. Eight hypotheses for the open-data instance were fixed in advance (Section 3.6.3).</w:t>
-      </w:r>
-    </w:p>
-    <w:bookmarkEnd w:id="136"/>
-    <w:bookmarkStart w:id="137" w:name="limitations"/>
-    <w:p>
-      <w:pPr>
-        <w:pStyle w:val="Heading2"/>
-      </w:pPr>
-      <w:r>
-        <w:t xml:space="preserve">4.2 Limitations</w:t>
       </w:r>
     </w:p>
     <w:p>
@@ -23456,13 +23106,13 @@
           <w:bCs/>
           <w:b/>
         </w:rPr>
-        <w:t xml:space="preserve">(L1) Synthetic worked instance.</w:t>
-      </w:r>
-      <w:r>
-        <w:t xml:space="preserve"> </w:t>
-      </w:r>
-      <w:r>
-        <w:t xml:space="preserve">Tables 10 to 16 demonstrate only that the pipeline obeys its own rules; they carry no empirical information about Albay. The classroom counts of E1 must not be read as estimates for any real school.</w:t>
+        <w:t xml:space="preserve">M1.</w:t>
+      </w:r>
+      <w:r>
+        <w:t xml:space="preserve"> </w:t>
+      </w:r>
+      <w:r>
+        <w:t xml:space="preserve">At Alert Level 3, the school-preserving plan closes fewer than half the classrooms of the time-only plan. Supported if the bootstrap interval of the ratio lies wholly below 0.5.</w:t>
       </w:r>
     </w:p>
     <w:p>
@@ -23478,13 +23128,13 @@
           <w:bCs/>
           <w:b/>
         </w:rPr>
-        <w:t xml:space="preserve">(L2) Capacities on roads are declared.</w:t>
-      </w:r>
-      <w:r>
-        <w:t xml:space="preserve"> </w:t>
-      </w:r>
-      <w:r>
-        <w:t xml:space="preserve">Road capacities stand in for both the road and the trucks assigned to it. Real evacuations depend on how many vehicles the local government has and where they start, which the model does not schedule.</w:t>
+        <w:t xml:space="preserve">M2.</w:t>
+      </w:r>
+      <w:r>
+        <w:t xml:space="preserve"> </w:t>
+      </w:r>
+      <w:r>
+        <w:t xml:space="preserve">The extra mean travel time of the school-preserving plan is below ten minutes per evacuee. Supported if the whole bootstrap interval falls under 10.</w:t>
       </w:r>
     </w:p>
     <w:p>
@@ -23500,13 +23150,13 @@
           <w:bCs/>
           <w:b/>
         </w:rPr>
-        <w:t xml:space="preserve">(L3) Everyone leaves at once.</w:t>
-      </w:r>
-      <w:r>
-        <w:t xml:space="preserve"> </w:t>
-      </w:r>
-      <w:r>
-        <w:t xml:space="preserve">Assumption 3 puts every evacuee on the road at minute zero. Real evacuations come in waves and people hesitate; the clearance time is therefore a best case for a given road network.</w:t>
+        <w:t xml:space="preserve">M3.</w:t>
+      </w:r>
+      <w:r>
+        <w:t xml:space="preserve"> </w:t>
+      </w:r>
+      <w:r>
+        <w:t xml:space="preserve">The nearest-site rule overfills at least one shelter in every scenario. Supported if the overflow is positive in all scenarios of Table 4.</w:t>
       </w:r>
     </w:p>
     <w:p>
@@ -23522,13 +23172,13 @@
           <w:bCs/>
           <w:b/>
         </w:rPr>
-        <w:t xml:space="preserve">(L4) Families may be split.</w:t>
-      </w:r>
-      <w:r>
-        <w:t xml:space="preserve"> </w:t>
-      </w:r>
-      <w:r>
-        <w:t xml:space="preserve">Assumption 5 allows the persons of one origin to go to different shelters. Keeping families together is a further constraint that would make the problem harder; the plan should be adjusted by the officer in charge.</w:t>
+        <w:t xml:space="preserve">M4.</w:t>
+      </w:r>
+      <w:r>
+        <w:t xml:space="preserve"> </w:t>
+      </w:r>
+      <w:r>
+        <w:t xml:space="preserve">Larger alert levels never free classrooms and closures never shorten the evacuation. Propositions 5 and 9 guarantee this exactly; any violation would therefore signal a data error, and the record would go back for checking.</w:t>
       </w:r>
     </w:p>
     <w:p>
@@ -23544,13 +23194,13 @@
           <w:bCs/>
           <w:b/>
         </w:rPr>
-        <w:t xml:space="preserve">(L5) Floor areas are not yet surveyed.</w:t>
-      </w:r>
-      <w:r>
-        <w:t xml:space="preserve"> </w:t>
-      </w:r>
-      <w:r>
-        <w:t xml:space="preserve">No register lists the usable floor area of every gymnasium, hall, and classroom, so capacities in the open-data instance will rest on building plans and the DepEd standard. A field inventory would replace them without changing the mathematics.</w:t>
+        <w:t xml:space="preserve">M5.</w:t>
+      </w:r>
+      <w:r>
+        <w:t xml:space="preserve"> </w:t>
+      </w:r>
+      <w:r>
+        <w:t xml:space="preserve">In the compound scenario, at least one barangay cluster is cut off from every shelter outside its pocket. Supported if the list of trapped origins is not empty; the list is then reported to the PDRRMO.</w:t>
       </w:r>
     </w:p>
     <w:p>
@@ -23566,13 +23216,13 @@
           <w:bCs/>
           <w:b/>
         </w:rPr>
-        <w:t xml:space="preserve">(L6) Accessibility is a single flag.</w:t>
-      </w:r>
-      <w:r>
-        <w:t xml:space="preserve"> </w:t>
-      </w:r>
-      <w:r>
-        <w:t xml:space="preserve">Real accessibility has degrees: a ramp, an accessible toilet, a ground-floor room. The model asks only whether a shelter is accessible.</w:t>
+        <w:t xml:space="preserve">M6.</w:t>
+      </w:r>
+      <w:r>
+        <w:t xml:space="preserve"> </w:t>
+      </w:r>
+      <w:r>
+        <w:t xml:space="preserve">Two Ligtas Pinoy Centers placed by Algorithm 3 cut the persons housed in classrooms at Alert Level 4 by at least 30 percent.</w:t>
       </w:r>
     </w:p>
     <w:p>
@@ -23588,13 +23238,66 @@
           <w:bCs/>
           <w:b/>
         </w:rPr>
-        <w:t xml:space="preserve">(L7) The space standard is one number.</w:t>
-      </w:r>
-      <w:r>
-        <w:t xml:space="preserve"> </w:t>
-      </w:r>
-      <w:r>
-        <w:t xml:space="preserve">The Sphere indicator of 3.5 square meters is a minimum for covered living space. Cooking, sanitation, and privacy need more, and the sweeps at 4.5 square meters bound the effect.</w:t>
+        <w:t xml:space="preserve">M7.</w:t>
+      </w:r>
+      <w:r>
+        <w:t xml:space="preserve"> </w:t>
+      </w:r>
+      <w:r>
+        <w:t xml:space="preserve">Every vulnerable resident can be placed in an accessible shelter at Alert Level 3. Supported if</w:t>
+      </w:r>
+      <w:r>
+        <w:t xml:space="preserve"> </w:t>
+      </w:r>
+      <w:r>
+        <w:rPr>
+          <w:iCs/>
+          <w:i/>
+        </w:rPr>
+        <w:t xml:space="preserve">F</w:t>
+      </w:r>
+      <w:r>
+        <w:rPr>
+          <w:iCs/>
+          <w:i/>
+          <w:vertAlign w:val="subscript"/>
+        </w:rPr>
+        <w:t xml:space="preserve">V</w:t>
+      </w:r>
+      <w:r>
+        <w:rPr>
+          <w:vertAlign w:val="superscript"/>
+        </w:rPr>
+        <w:t xml:space="preserve">*</w:t>
+      </w:r>
+      <w:r>
+        <w:t xml:space="preserve"> </w:t>
+      </w:r>
+      <w:r>
+        <w:t xml:space="preserve">=</w:t>
+      </w:r>
+      <w:r>
+        <w:t xml:space="preserve"> </w:t>
+      </w:r>
+      <w:r>
+        <w:rPr>
+          <w:iCs/>
+          <w:i/>
+        </w:rPr>
+        <w:t xml:space="preserve">V</w:t>
+      </w:r>
+      <w:r>
+        <w:t xml:space="preserve">(</w:t>
+      </w:r>
+      <w:r>
+        <w:rPr>
+          <w:iCs/>
+          <w:i/>
+        </w:rPr>
+        <w:t xml:space="preserve">σ</w:t>
+      </w:r>
+      <w:r>
+        <w:t xml:space="preserve">); otherwise the deficit is reported by municipality.</w:t>
       </w:r>
     </w:p>
     <w:p>
@@ -23610,20 +23313,298 @@
           <w:bCs/>
           <w:b/>
         </w:rPr>
-        <w:t xml:space="preserve">(L8) Safety of shelters.</w:t>
-      </w:r>
-      <w:r>
-        <w:t xml:space="preserve"> </w:t>
-      </w:r>
-      <w:r>
-        <w:t xml:space="preserve">Assumption 7 treats a shelter outside the danger zones as safe. Ashfall reached up to 132 schools in Albay in May 2026 (Philippine Star, 2026), and a shelter under heavy ash may need to close.</w:t>
+        <w:t xml:space="preserve">M8.</w:t>
+      </w:r>
+      <w:r>
+        <w:t xml:space="preserve"> </w:t>
+      </w:r>
+      <w:r>
+        <w:t xml:space="preserve">The ranking of municipalities by classrooms closed is stable under the space standard: Spearman’s</w:t>
+      </w:r>
+      <w:r>
+        <w:t xml:space="preserve"> </w:t>
+      </w:r>
+      <w:r>
+        <w:rPr>
+          <w:iCs/>
+          <w:i/>
+        </w:rPr>
+        <w:t xml:space="preserve">ρ</w:t>
+      </w:r>
+      <w:r>
+        <w:t xml:space="preserve"> </w:t>
+      </w:r>
+      <w:r>
+        <w:t xml:space="preserve">above 0.8.</w:t>
+      </w:r>
+    </w:p>
+    <w:p>
+      <w:pPr>
+        <w:pStyle w:val="FirstParagraph"/>
+      </w:pPr>
+      <w:r>
+        <w:t xml:space="preserve">Within the model, M1, M2, and M6 measure the trade-offs relevant to targets 4.a and 11.5.</w:t>
+      </w:r>
+    </w:p>
+    <w:bookmarkEnd w:id="136"/>
+    <w:bookmarkStart w:id="137" w:name="sensitivity-sweeps"/>
+    <w:p>
+      <w:pPr>
+        <w:pStyle w:val="Heading3"/>
+      </w:pPr>
+      <w:r>
+        <w:t xml:space="preserve">3.6.4 Sensitivity Sweeps</w:t>
+      </w:r>
+    </w:p>
+    <w:p>
+      <w:pPr>
+        <w:pStyle w:val="FirstParagraph"/>
+      </w:pPr>
+      <w:r>
+        <w:t xml:space="preserve">Across seven sweeps, the main results are recomputed over a range of one parameter at a time: the space standard, the classroom capacity,</w:t>
+      </w:r>
+      <w:r>
+        <w:t xml:space="preserve"> </w:t>
+      </w:r>
+      <w:r>
+        <w:rPr>
+          <w:iCs/>
+          <w:i/>
+        </w:rPr>
+        <w:t xml:space="preserve">θ</w:t>
+      </w:r>
+      <w:r>
+        <w:rPr>
+          <w:vertAlign w:val="subscript"/>
+        </w:rPr>
+        <w:t xml:space="preserve">max</w:t>
+      </w:r>
+      <w:r>
+        <w:t xml:space="preserve">, road capacities, travel speeds, the vulnerable share, and the travel-time standard</w:t>
+      </w:r>
+      <w:r>
+        <w:t xml:space="preserve"> </w:t>
+      </w:r>
+      <w:r>
+        <w:rPr>
+          <w:iCs/>
+          <w:i/>
+        </w:rPr>
+        <w:t xml:space="preserve">θ</w:t>
+      </w:r>
+      <w:r>
+        <w:t xml:space="preserve"> </w:t>
+      </w:r>
+      <w:r>
+        <w:t xml:space="preserve">of the siting problem (15, 30, and 45 minutes).</w:t>
+      </w:r>
+    </w:p>
+    <w:bookmarkEnd w:id="137"/>
+    <w:bookmarkEnd w:id="138"/>
+    <w:bookmarkEnd w:id="139"/>
+    <w:bookmarkStart w:id="144" w:name="conclusions"/>
+    <w:p>
+      <w:pPr>
+        <w:pStyle w:val="Heading1"/>
+      </w:pPr>
+      <w:r>
+        <w:t xml:space="preserve">4. CONCLUSIONS</w:t>
+      </w:r>
+    </w:p>
+    <w:bookmarkStart w:id="140" w:name="evaluation-of-the-findings"/>
+    <w:p>
+      <w:pPr>
+        <w:pStyle w:val="Heading2"/>
+      </w:pPr>
+      <w:r>
+        <w:t xml:space="preserve">4.1 Evaluation of the Findings</w:t>
+      </w:r>
+    </w:p>
+    <w:p>
+      <w:pPr>
+        <w:pStyle w:val="FirstParagraph"/>
+      </w:pPr>
+      <w:r>
+        <w:t xml:space="preserve">This study set out to answer one main question. How can each evacuee from an Albay hazard zone receive a shelter so that vulnerable residents come first, everyone has a place, and the fewest classrooms close? The question also covered how much time such an evacuation would need. The findings show that such a plan can be stated precisely and solved exactly within seconds on a laptop. Separately written code confirms it, and it can be analyzed before any field survey.</w:t>
+      </w:r>
+    </w:p>
+    <w:p>
+      <w:pPr>
+        <w:pStyle w:val="BodyText"/>
+      </w:pPr>
+      <w:r>
+        <w:rPr>
+          <w:bCs/>
+          <w:b/>
+        </w:rPr>
+        <w:t xml:space="preserve">Objective 1: hazards, origins, roads, and shelters.</w:t>
+      </w:r>
+      <w:r>
+        <w:t xml:space="preserve"> </w:t>
+      </w:r>
+      <w:r>
+        <w:t xml:space="preserve">Scenarios, origins, the road network, and shelter capacities were defined from public registers and published standards (Definitions 1 to 6). A standard classroom holds 18 evacuees at the Sphere indicator, which turns the abstract rule</w:t>
+      </w:r>
+      <w:r>
+        <w:t xml:space="preserve"> </w:t>
+      </w:r>
+      <w:r>
+        <w:t xml:space="preserve">“</w:t>
+      </w:r>
+      <w:r>
+        <w:t xml:space="preserve">classrooms last</w:t>
+      </w:r>
+      <w:r>
+        <w:t xml:space="preserve">”</w:t>
+      </w:r>
+      <w:r>
+        <w:t xml:space="preserve"> </w:t>
+      </w:r>
+      <w:r>
+        <w:t xml:space="preserve">into a count that can be minimized.</w:t>
+      </w:r>
+    </w:p>
+    <w:p>
+      <w:pPr>
+        <w:pStyle w:val="BodyText"/>
+      </w:pPr>
+      <w:r>
+        <w:rPr>
+          <w:bCs/>
+          <w:b/>
+        </w:rPr>
+        <w:t xml:space="preserve">Objective 2: the lexicographic shelter plan.</w:t>
+      </w:r>
+      <w:r>
+        <w:t xml:space="preserve"> </w:t>
+      </w:r>
+      <w:r>
+        <w:t xml:space="preserve">The legal order of priorities became one minimum-cost flow. Plans are always in whole persons (Proposition 1), placing vulnerable residents first never costs anyone a place (Proposition 2), and the penalties reproduce the order exactly (Proposition 3). The plan matched five sequential linear programs at every level in all 300 test instances.</w:t>
+      </w:r>
+    </w:p>
+    <w:p>
+      <w:pPr>
+        <w:pStyle w:val="BodyText"/>
+      </w:pPr>
+      <w:r>
+        <w:rPr>
+          <w:bCs/>
+          <w:b/>
+        </w:rPr>
+        <w:t xml:space="preserve">Objective 3: classrooms and alert levels.</w:t>
+      </w:r>
+      <w:r>
+        <w:t xml:space="preserve"> </w:t>
+      </w:r>
+      <w:r>
+        <w:t xml:space="preserve">Packing evacuees into full classrooms closes at most one more classroom per school in use than the true minimum (Proposition 4); in 144 of 150 exact comparisons it closed none more. A higher alert level never frees classrooms (Proposition 5), which lets local governments plan once for the highest level.</w:t>
+      </w:r>
+    </w:p>
+    <w:p>
+      <w:pPr>
+        <w:pStyle w:val="BodyText"/>
+      </w:pPr>
+      <w:r>
+        <w:rPr>
+          <w:bCs/>
+          <w:b/>
+        </w:rPr>
+        <w:t xml:space="preserve">Objective 4: clearance time.</w:t>
+      </w:r>
+      <w:r>
+        <w:t xml:space="preserve"> </w:t>
+      </w:r>
+      <w:r>
+        <w:t xml:space="preserve">The time-expanded network gives the exact clearance time (Propositions 6 and 7) and agreed with the Ford-Fulkerson formula in all 660 tests; bisection found it with about five maximum-flow computations instead of about 27. The lower bound of Proposition 8 was never violated.</w:t>
+      </w:r>
+    </w:p>
+    <w:p>
+      <w:pPr>
+        <w:pStyle w:val="BodyText"/>
+      </w:pPr>
+      <w:r>
+        <w:rPr>
+          <w:bCs/>
+          <w:b/>
+        </w:rPr>
+        <w:t xml:space="preserve">Objective 5: closures and new shelters.</w:t>
+      </w:r>
+      <w:r>
+        <w:t xml:space="preserve"> </w:t>
+      </w:r>
+      <w:r>
+        <w:t xml:space="preserve">Closures never shorten an evacuation and new shelters never add classroom use when everyone is already sheltered (Proposition 9); no violation appeared in 463 checks. On E1, single bridges did not matter, but losing both lahar channels trapped 450 residents in a pocket served by one school.</w:t>
+      </w:r>
+    </w:p>
+    <w:p>
+      <w:pPr>
+        <w:pStyle w:val="BodyText"/>
+      </w:pPr>
+      <w:r>
+        <w:rPr>
+          <w:bCs/>
+          <w:b/>
+        </w:rPr>
+        <w:t xml:space="preserve">Objective 6: Ligtas Pinoy Center siting.</w:t>
+      </w:r>
+      <w:r>
+        <w:t xml:space="preserve"> </w:t>
+      </w:r>
+      <w:r>
+        <w:t xml:space="preserve">Because the extra coverage from new centers is submodular, greedy siting always attains no less than 63.2 percent of the optimum (Proposition 10). Across the test instances, greedy siting never dropped below 89.0 percent of the optimum and matched it exactly in 94.7 percent of them.</w:t>
+      </w:r>
+    </w:p>
+    <w:p>
+      <w:pPr>
+        <w:pStyle w:val="BodyText"/>
+      </w:pPr>
+      <w:r>
+        <w:rPr>
+          <w:bCs/>
+          <w:b/>
+        </w:rPr>
+        <w:t xml:space="preserve">Objective 7: verification.</w:t>
+      </w:r>
+      <w:r>
+        <w:t xml:space="preserve"> </w:t>
+      </w:r>
+      <w:r>
+        <w:t xml:space="preserve">Every proven property was checked against independently written code, and none failed (Table 7). Computing a plan for 160 origin clusters and 120 shelters took under three seconds in plain Python.</w:t>
+      </w:r>
+    </w:p>
+    <w:p>
+      <w:pPr>
+        <w:pStyle w:val="BodyText"/>
+      </w:pPr>
+      <w:r>
+        <w:rPr>
+          <w:bCs/>
+          <w:b/>
+        </w:rPr>
+        <w:t xml:space="preserve">Objective 8: worked instance and hypotheses.</w:t>
+      </w:r>
+      <w:r>
+        <w:t xml:space="preserve"> </w:t>
+      </w:r>
+      <w:r>
+        <w:t xml:space="preserve">The synthetic volcano makes the stakes concrete. At Alert Level 3 the school-preserving plan closed 14 classrooms instead of 40 and displaced 532 learners instead of 1,702, at a cost of 1.70 minutes of average travel; the nearest-site rule would have sent 298 people to full shelters. Eight hypotheses for the open-data instance were fixed in advance (Section 3.6.3).</w:t>
+      </w:r>
+    </w:p>
+    <w:bookmarkEnd w:id="140"/>
+    <w:bookmarkStart w:id="141" w:name="limitations"/>
+    <w:p>
+      <w:pPr>
+        <w:pStyle w:val="Heading2"/>
+      </w:pPr>
+      <w:r>
+        <w:t xml:space="preserve">4.2 Limitations</w:t>
       </w:r>
     </w:p>
     <w:p>
       <w:pPr>
         <w:numPr>
           <w:ilvl w:val="0"/>
-          <w:numId w:val="1007"/>
+          <w:numId w:val="1008"/>
         </w:numPr>
         <w:pStyle w:val="Compact"/>
       </w:pPr>
@@ -23632,20 +23613,20 @@
           <w:bCs/>
           <w:b/>
         </w:rPr>
-        <w:t xml:space="preserve">(L9) Stays, not only trips.</w:t>
-      </w:r>
-      <w:r>
-        <w:t xml:space="preserve"> </w:t>
-      </w:r>
-      <w:r>
-        <w:t xml:space="preserve">The model plans the trip and the first placement. It does not model the length of stay, the return home, or the rotation of classrooms during a long evacuation.</w:t>
+        <w:t xml:space="preserve">(L1) Synthetic worked instance.</w:t>
+      </w:r>
+      <w:r>
+        <w:t xml:space="preserve"> </w:t>
+      </w:r>
+      <w:r>
+        <w:t xml:space="preserve">Tables 10 to 16 demonstrate only that the pipeline obeys its own rules; they carry no empirical information about Albay. The classroom counts of E1 must not be read as estimates for any real school.</w:t>
       </w:r>
     </w:p>
     <w:p>
       <w:pPr>
         <w:numPr>
           <w:ilvl w:val="0"/>
-          <w:numId w:val="1007"/>
+          <w:numId w:val="1008"/>
         </w:numPr>
         <w:pStyle w:val="Compact"/>
       </w:pPr>
@@ -23654,20 +23635,20 @@
           <w:bCs/>
           <w:b/>
         </w:rPr>
-        <w:t xml:space="preserve">(L10) Coverage-based siting.</w:t>
-      </w:r>
-      <w:r>
-        <w:t xml:space="preserve"> </w:t>
-      </w:r>
-      <w:r>
-        <w:t xml:space="preserve">Definition 14 counts evacuees who could be sheltered outside classrooms. It ignores the cost of land and construction and the use of a center between disasters.</w:t>
+        <w:t xml:space="preserve">(L2) Capacities on roads are declared.</w:t>
+      </w:r>
+      <w:r>
+        <w:t xml:space="preserve"> </w:t>
+      </w:r>
+      <w:r>
+        <w:t xml:space="preserve">Road capacities stand in for both the road and the trucks assigned to it. Real evacuations depend on how many vehicles the local government has and where they start, which the model does not schedule.</w:t>
       </w:r>
     </w:p>
     <w:p>
       <w:pPr>
         <w:numPr>
           <w:ilvl w:val="0"/>
-          <w:numId w:val="1007"/>
+          <w:numId w:val="1008"/>
         </w:numPr>
         <w:pStyle w:val="Compact"/>
       </w:pPr>
@@ -23676,195 +23657,217 @@
           <w:bCs/>
           <w:b/>
         </w:rPr>
-        <w:t xml:space="preserve">(L11) Provincial border.</w:t>
-      </w:r>
-      <w:r>
-        <w:t xml:space="preserve"> </w:t>
-      </w:r>
-      <w:r>
-        <w:t xml:space="preserve">Shelters in Camarines Sur or Sorsogon are not considered, which may understate the options for border municipalities.</w:t>
-      </w:r>
-    </w:p>
-    <w:bookmarkEnd w:id="137"/>
-    <w:bookmarkStart w:id="138" w:name="X17e47b0ee523611b9a881cade5b2e463dc95e7c"/>
-    <w:p>
-      <w:pPr>
-        <w:pStyle w:val="Heading2"/>
-      </w:pPr>
-      <w:r>
-        <w:t xml:space="preserve">4.3 Recommendations and Challenges in Extending the Results</w:t>
-      </w:r>
-    </w:p>
-    <w:p>
-      <w:pPr>
-        <w:pStyle w:val="FirstParagraph"/>
+        <w:t xml:space="preserve">(L3) Everyone leaves at once.</w:t>
+      </w:r>
+      <w:r>
+        <w:t xml:space="preserve"> </w:t>
+      </w:r>
+      <w:r>
+        <w:t xml:space="preserve">Assumption 3 puts every evacuee on the road at minute zero. Real evacuations come in waves and people hesitate; the clearance time is therefore a best case for a given road network.</w:t>
+      </w:r>
+    </w:p>
+    <w:p>
+      <w:pPr>
+        <w:numPr>
+          <w:ilvl w:val="0"/>
+          <w:numId w:val="1008"/>
+        </w:numPr>
+        <w:pStyle w:val="Compact"/>
       </w:pPr>
       <w:r>
         <w:rPr>
           <w:bCs/>
           <w:b/>
         </w:rPr>
-        <w:t xml:space="preserve">Shelter inventory.</w:t>
-      </w:r>
-      <w:r>
-        <w:t xml:space="preserve"> </w:t>
-      </w:r>
-      <w:r>
-        <w:t xml:space="preserve">The first step is an inventory of every designated evacuation center and every school in the danger-zone municipalities, with floor areas of gymnasiums, halls, and classrooms, accessibility, and contact persons, following the schema of Appendix C. DepEd Albay and the municipal disaster offices already hold most of this information.</w:t>
-      </w:r>
-    </w:p>
-    <w:p>
-      <w:pPr>
-        <w:pStyle w:val="BodyText"/>
+        <w:t xml:space="preserve">(L4) Families may be split.</w:t>
+      </w:r>
+      <w:r>
+        <w:t xml:space="preserve"> </w:t>
+      </w:r>
+      <w:r>
+        <w:t xml:space="preserve">Assumption 5 allows the persons of one origin to go to different shelters. Keeping families together is a further constraint that would make the problem harder; the plan should be adjusted by the officer in charge.</w:t>
+      </w:r>
+    </w:p>
+    <w:p>
+      <w:pPr>
+        <w:numPr>
+          <w:ilvl w:val="0"/>
+          <w:numId w:val="1008"/>
+        </w:numPr>
+        <w:pStyle w:val="Compact"/>
       </w:pPr>
       <w:r>
         <w:rPr>
           <w:bCs/>
           <w:b/>
         </w:rPr>
-        <w:t xml:space="preserve">Field validation.</w:t>
-      </w:r>
-      <w:r>
-        <w:t xml:space="preserve"> </w:t>
-      </w:r>
-      <w:r>
-        <w:t xml:space="preserve">Evacuation drills give the data needed to calibrate road capacities: the number of trucks, their loads, and the time between trips. Records of the January and May 2026 evacuations from the reports of the DSWD would allow a direct test: given the evacuees and centers actually used, how many classrooms would the plan have kept open?</w:t>
-      </w:r>
-    </w:p>
-    <w:p>
-      <w:pPr>
-        <w:pStyle w:val="BodyText"/>
+        <w:t xml:space="preserve">(L5) Floor areas are not yet surveyed.</w:t>
+      </w:r>
+      <w:r>
+        <w:t xml:space="preserve"> </w:t>
+      </w:r>
+      <w:r>
+        <w:t xml:space="preserve">No register lists the usable floor area of every gymnasium, hall, and classroom, so capacities in the open-data instance will rest on building plans and the DepEd standard. A field inventory would replace them without changing the mathematics.</w:t>
+      </w:r>
+    </w:p>
+    <w:p>
+      <w:pPr>
+        <w:numPr>
+          <w:ilvl w:val="0"/>
+          <w:numId w:val="1008"/>
+        </w:numPr>
+        <w:pStyle w:val="Compact"/>
       </w:pPr>
       <w:r>
         <w:rPr>
           <w:bCs/>
           <w:b/>
         </w:rPr>
-        <w:t xml:space="preserve">Use by the Provincial Government.</w:t>
-      </w:r>
-      <w:r>
-        <w:t xml:space="preserve"> </w:t>
-      </w:r>
-      <w:r>
-        <w:t xml:space="preserve">Moving the model into operation needs the consent and oversight of the Provincial Disaster Risk Reduction and Management Office (PDRRMO), the Albay Public Safety and Emergency Management Office (APSEMO), and the Schools Division Offices. The plan should be offered as advice to the officer who signs the evacuation order, never as an automatic order.</w:t>
-      </w:r>
-    </w:p>
-    <w:p>
-      <w:pPr>
-        <w:pStyle w:val="BodyText"/>
+        <w:t xml:space="preserve">(L6) Accessibility is a single flag.</w:t>
+      </w:r>
+      <w:r>
+        <w:t xml:space="preserve"> </w:t>
+      </w:r>
+      <w:r>
+        <w:t xml:space="preserve">Real accessibility has degrees: a ramp, an accessible toilet, a ground-floor room. The model asks only whether a shelter is accessible.</w:t>
+      </w:r>
+    </w:p>
+    <w:p>
+      <w:pPr>
+        <w:numPr>
+          <w:ilvl w:val="0"/>
+          <w:numId w:val="1008"/>
+        </w:numPr>
+        <w:pStyle w:val="Compact"/>
       </w:pPr>
       <w:r>
         <w:rPr>
           <w:bCs/>
           <w:b/>
         </w:rPr>
-        <w:t xml:space="preserve">Ligtas Pinoy Centers.</w:t>
-      </w:r>
-      <w:r>
-        <w:t xml:space="preserve"> </w:t>
-      </w:r>
-      <w:r>
-        <w:t xml:space="preserve">Local governments preparing proposals under Republic Act No. 12076 can use Algorithm 3 to rank candidate lots by the classrooms they would free, then weigh the ranking against land, cost, and hazard information that the model does not hold.</w:t>
-      </w:r>
-    </w:p>
-    <w:p>
-      <w:pPr>
-        <w:pStyle w:val="BodyText"/>
+        <w:t xml:space="preserve">(L7) The space standard is one number.</w:t>
+      </w:r>
+      <w:r>
+        <w:t xml:space="preserve"> </w:t>
+      </w:r>
+      <w:r>
+        <w:t xml:space="preserve">The Sphere indicator of 3.5 square meters is a minimum for covered living space. Cooking, sanitation, and privacy need more, and the sweeps at 4.5 square meters bound the effect.</w:t>
+      </w:r>
+    </w:p>
+    <w:p>
+      <w:pPr>
+        <w:numPr>
+          <w:ilvl w:val="0"/>
+          <w:numId w:val="1008"/>
+        </w:numPr>
+        <w:pStyle w:val="Compact"/>
       </w:pPr>
       <w:r>
         <w:rPr>
           <w:bCs/>
           <w:b/>
         </w:rPr>
-        <w:t xml:space="preserve">Extensions.</w:t>
-      </w:r>
-      <w:r>
-        <w:t xml:space="preserve"> </w:t>
-      </w:r>
-      <w:r>
-        <w:t xml:space="preserve">Three extensions follow directly from the mathematics: waves of departure (one plan per wave, with the shelters already used carried forward), family integrity (whole families as flow units, which turns the plan into an integer program), and vehicle routing for the vulnerable, who often cannot walk to a pick-up point.</w:t>
-      </w:r>
-    </w:p>
-    <w:bookmarkEnd w:id="138"/>
-    <w:bookmarkStart w:id="139" w:name="applications"/>
-    <w:p>
-      <w:pPr>
-        <w:pStyle w:val="Heading2"/>
-      </w:pPr>
-      <w:r>
-        <w:t xml:space="preserve">4.4 Applications</w:t>
-      </w:r>
-    </w:p>
-    <w:p>
-      <w:pPr>
-        <w:pStyle w:val="FirstParagraph"/>
+        <w:t xml:space="preserve">(L8) Safety of shelters.</w:t>
+      </w:r>
+      <w:r>
+        <w:t xml:space="preserve"> </w:t>
+      </w:r>
+      <w:r>
+        <w:t xml:space="preserve">Assumption 7 treats a shelter outside the danger zones as safe. Ashfall reached up to 132 schools in Albay in May 2026 (Philippine Star, 2026), and a shelter under heavy ash may need to close.</w:t>
+      </w:r>
+    </w:p>
+    <w:p>
+      <w:pPr>
+        <w:numPr>
+          <w:ilvl w:val="0"/>
+          <w:numId w:val="1008"/>
+        </w:numPr>
+        <w:pStyle w:val="Compact"/>
       </w:pPr>
       <w:r>
         <w:rPr>
           <w:bCs/>
           <w:b/>
         </w:rPr>
-        <w:t xml:space="preserve">For families.</w:t>
-      </w:r>
-      <w:r>
-        <w:t xml:space="preserve"> </w:t>
-      </w:r>
-      <w:r>
-        <w:t xml:space="preserve">A family in a danger zone can see, before an alert, which shelter its barangay is assigned to at each alert level, how long the trip takes, and whether the shelter is accessible for an older or disabled member.</w:t>
-      </w:r>
-    </w:p>
-    <w:p>
-      <w:pPr>
-        <w:pStyle w:val="BodyText"/>
+        <w:t xml:space="preserve">(L9) Stays, not only trips.</w:t>
+      </w:r>
+      <w:r>
+        <w:t xml:space="preserve"> </w:t>
+      </w:r>
+      <w:r>
+        <w:t xml:space="preserve">The model plans the trip and the first placement. It does not model the length of stay, the return home, or the rotation of classrooms during a long evacuation.</w:t>
+      </w:r>
+    </w:p>
+    <w:p>
+      <w:pPr>
+        <w:numPr>
+          <w:ilvl w:val="0"/>
+          <w:numId w:val="1008"/>
+        </w:numPr>
+        <w:pStyle w:val="Compact"/>
       </w:pPr>
       <w:r>
         <w:rPr>
           <w:bCs/>
           <w:b/>
         </w:rPr>
-        <w:t xml:space="preserve">For barangay captains and school heads.</w:t>
-      </w:r>
-      <w:r>
-        <w:t xml:space="preserve"> </w:t>
-      </w:r>
-      <w:r>
-        <w:t xml:space="preserve">A school head can see in advance whether, and how many of, the school’s classrooms are likely to be needed at each alert level, and can prepare learning materials for the classes that would move to modular or blended learning.</w:t>
-      </w:r>
-    </w:p>
-    <w:p>
-      <w:pPr>
-        <w:pStyle w:val="BodyText"/>
+        <w:t xml:space="preserve">(L10) Coverage-based siting.</w:t>
+      </w:r>
+      <w:r>
+        <w:t xml:space="preserve"> </w:t>
+      </w:r>
+      <w:r>
+        <w:t xml:space="preserve">Definition 14 counts evacuees who could be sheltered outside classrooms. It ignores the cost of land and construction and the use of a center between disasters.</w:t>
+      </w:r>
+    </w:p>
+    <w:p>
+      <w:pPr>
+        <w:numPr>
+          <w:ilvl w:val="0"/>
+          <w:numId w:val="1008"/>
+        </w:numPr>
+        <w:pStyle w:val="Compact"/>
       </w:pPr>
       <w:r>
         <w:rPr>
           <w:bCs/>
           <w:b/>
         </w:rPr>
-        <w:t xml:space="preserve">For the PDRRMO, APSEMO, and DepEd.</w:t>
-      </w:r>
-      <w:r>
-        <w:t xml:space="preserve"> </w:t>
-      </w:r>
-      <w:r>
-        <w:t xml:space="preserve">During an alert, the plan can be recomputed in seconds when a shelter fills or a bridge fails; the clearance time tells the office how early the order must be given; and the channel closure analysis tells it which pockets must be emptied before heavy rain.</w:t>
-      </w:r>
-    </w:p>
-    <w:p>
-      <w:pPr>
-        <w:pStyle w:val="BodyText"/>
+        <w:t xml:space="preserve">(L11) Provincial border.</w:t>
+      </w:r>
+      <w:r>
+        <w:t xml:space="preserve"> </w:t>
+      </w:r>
+      <w:r>
+        <w:t xml:space="preserve">Shelters in Camarines Sur or Sorsogon are not considered, which may understate the options for border municipalities.</w:t>
+      </w:r>
+    </w:p>
+    <w:bookmarkEnd w:id="141"/>
+    <w:bookmarkStart w:id="142" w:name="X17e47b0ee523611b9a881cade5b2e463dc95e7c"/>
+    <w:p>
+      <w:pPr>
+        <w:pStyle w:val="Heading2"/>
+      </w:pPr>
+      <w:r>
+        <w:t xml:space="preserve">4.3 Recommendations and Challenges in Extending the Results</w:t>
+      </w:r>
+    </w:p>
+    <w:p>
+      <w:pPr>
+        <w:pStyle w:val="FirstParagraph"/>
       </w:pPr>
       <w:r>
         <w:rPr>
           <w:bCs/>
           <w:b/>
         </w:rPr>
-        <w:t xml:space="preserve">For planners.</w:t>
-      </w:r>
-      <w:r>
-        <w:t xml:space="preserve"> </w:t>
-      </w:r>
-      <w:r>
-        <w:t xml:space="preserve">The siting tool proposes where a Ligtas Pinoy Center would shelter the most evacuees outside classrooms, and Proposition 10 guarantees the quality of the proposal.</w:t>
+        <w:t xml:space="preserve">Shelter inventory.</w:t>
+      </w:r>
+      <w:r>
+        <w:t xml:space="preserve"> </w:t>
+      </w:r>
+      <w:r>
+        <w:t xml:space="preserve">The first step is an inventory of every designated evacuation center and every school in the danger-zone municipalities, with floor areas of gymnasiums, halls, and classrooms, accessibility, and contact persons, following the schema of Appendix C. DepEd Albay and the municipal disaster offices already hold most of this information.</w:t>
       </w:r>
     </w:p>
     <w:p>
@@ -23876,13 +23879,13 @@
           <w:bCs/>
           <w:b/>
         </w:rPr>
-        <w:t xml:space="preserve">Links to the Sustainable Development Goals.</w:t>
-      </w:r>
-      <w:r>
-        <w:t xml:space="preserve"> </w:t>
-      </w:r>
-      <w:r>
-        <w:t xml:space="preserve">Every application above maps onto a specific target of the 2030 Agenda, although actual deployment remains a future step: open classrooms serve target 4.a, timely shelter for all serves targets 11.5 and 13.1, and placing vulnerable residents first serves target 10.2.</w:t>
+        <w:t xml:space="preserve">Field validation.</w:t>
+      </w:r>
+      <w:r>
+        <w:t xml:space="preserve"> </w:t>
+      </w:r>
+      <w:r>
+        <w:t xml:space="preserve">Evacuation drills give the data needed to calibrate road capacities: the number of trucks, their loads, and the time between trips. Records of the January and May 2026 evacuations from the reports of the DSWD would allow a direct test: given the evacuees and centers actually used, how many classrooms would the plan have kept open?</w:t>
       </w:r>
     </w:p>
     <w:p>
@@ -23894,6 +23897,160 @@
           <w:bCs/>
           <w:b/>
         </w:rPr>
+        <w:t xml:space="preserve">Use by the Provincial Government.</w:t>
+      </w:r>
+      <w:r>
+        <w:t xml:space="preserve"> </w:t>
+      </w:r>
+      <w:r>
+        <w:t xml:space="preserve">Moving the model into operation needs the consent and oversight of the Provincial Disaster Risk Reduction and Management Office (PDRRMO), the Albay Public Safety and Emergency Management Office (APSEMO), and the Schools Division Offices. The plan should be offered as advice to the officer who signs the evacuation order, never as an automatic order.</w:t>
+      </w:r>
+    </w:p>
+    <w:p>
+      <w:pPr>
+        <w:pStyle w:val="BodyText"/>
+      </w:pPr>
+      <w:r>
+        <w:rPr>
+          <w:bCs/>
+          <w:b/>
+        </w:rPr>
+        <w:t xml:space="preserve">Ligtas Pinoy Centers.</w:t>
+      </w:r>
+      <w:r>
+        <w:t xml:space="preserve"> </w:t>
+      </w:r>
+      <w:r>
+        <w:t xml:space="preserve">Local governments preparing proposals under Republic Act No. 12076 can use Algorithm 3 to rank candidate lots by the classrooms they would free, then weigh the ranking against land, cost, and hazard information that the model does not hold.</w:t>
+      </w:r>
+    </w:p>
+    <w:p>
+      <w:pPr>
+        <w:pStyle w:val="BodyText"/>
+      </w:pPr>
+      <w:r>
+        <w:rPr>
+          <w:bCs/>
+          <w:b/>
+        </w:rPr>
+        <w:t xml:space="preserve">Extensions.</w:t>
+      </w:r>
+      <w:r>
+        <w:t xml:space="preserve"> </w:t>
+      </w:r>
+      <w:r>
+        <w:t xml:space="preserve">Three extensions follow directly from the mathematics: waves of departure (one plan per wave, with the shelters already used carried forward), family integrity (whole families as flow units, which turns the plan into an integer program), and vehicle routing for the vulnerable, who often cannot walk to a pick-up point.</w:t>
+      </w:r>
+    </w:p>
+    <w:bookmarkEnd w:id="142"/>
+    <w:bookmarkStart w:id="143" w:name="applications"/>
+    <w:p>
+      <w:pPr>
+        <w:pStyle w:val="Heading2"/>
+      </w:pPr>
+      <w:r>
+        <w:t xml:space="preserve">4.4 Applications</w:t>
+      </w:r>
+    </w:p>
+    <w:p>
+      <w:pPr>
+        <w:pStyle w:val="FirstParagraph"/>
+      </w:pPr>
+      <w:r>
+        <w:rPr>
+          <w:bCs/>
+          <w:b/>
+        </w:rPr>
+        <w:t xml:space="preserve">For families.</w:t>
+      </w:r>
+      <w:r>
+        <w:t xml:space="preserve"> </w:t>
+      </w:r>
+      <w:r>
+        <w:t xml:space="preserve">A family in a danger zone can see, before an alert, which shelter its barangay is assigned to at each alert level, how long the trip takes, and whether the shelter is accessible for an older or disabled member.</w:t>
+      </w:r>
+    </w:p>
+    <w:p>
+      <w:pPr>
+        <w:pStyle w:val="BodyText"/>
+      </w:pPr>
+      <w:r>
+        <w:rPr>
+          <w:bCs/>
+          <w:b/>
+        </w:rPr>
+        <w:t xml:space="preserve">For barangay captains and school heads.</w:t>
+      </w:r>
+      <w:r>
+        <w:t xml:space="preserve"> </w:t>
+      </w:r>
+      <w:r>
+        <w:t xml:space="preserve">A school head can see in advance whether, and how many of, the school’s classrooms are likely to be needed at each alert level, and can prepare learning materials for the classes that would move to modular or blended learning.</w:t>
+      </w:r>
+    </w:p>
+    <w:p>
+      <w:pPr>
+        <w:pStyle w:val="BodyText"/>
+      </w:pPr>
+      <w:r>
+        <w:rPr>
+          <w:bCs/>
+          <w:b/>
+        </w:rPr>
+        <w:t xml:space="preserve">For the PDRRMO, APSEMO, and DepEd.</w:t>
+      </w:r>
+      <w:r>
+        <w:t xml:space="preserve"> </w:t>
+      </w:r>
+      <w:r>
+        <w:t xml:space="preserve">During an alert, the plan can be recomputed in seconds when a shelter fills or a bridge fails; the clearance time tells the office how early the order must be given; and the channel closure analysis tells it which pockets must be emptied before heavy rain.</w:t>
+      </w:r>
+    </w:p>
+    <w:p>
+      <w:pPr>
+        <w:pStyle w:val="BodyText"/>
+      </w:pPr>
+      <w:r>
+        <w:rPr>
+          <w:bCs/>
+          <w:b/>
+        </w:rPr>
+        <w:t xml:space="preserve">For planners.</w:t>
+      </w:r>
+      <w:r>
+        <w:t xml:space="preserve"> </w:t>
+      </w:r>
+      <w:r>
+        <w:t xml:space="preserve">The siting tool proposes where a Ligtas Pinoy Center would shelter the most evacuees outside classrooms, and Proposition 10 guarantees the quality of the proposal.</w:t>
+      </w:r>
+    </w:p>
+    <w:p>
+      <w:pPr>
+        <w:pStyle w:val="BodyText"/>
+      </w:pPr>
+      <w:r>
+        <w:rPr>
+          <w:bCs/>
+          <w:b/>
+        </w:rPr>
+        <w:t xml:space="preserve">Links to the Sustainable Development Goals.</w:t>
+      </w:r>
+      <w:r>
+        <w:t xml:space="preserve"> </w:t>
+      </w:r>
+      <w:r>
+        <w:t xml:space="preserve">Every application above maps onto a specific target of the 2030 Agenda, although actual deployment remains a future step: open classrooms serve target 4.a, timely shelter for all serves targets 11.5 and 13.1, and placing vulnerable residents first serves target 10.2.</w:t>
+      </w:r>
+    </w:p>
+    <w:p>
+      <w:pPr>
+        <w:pStyle w:val="BodyText"/>
+      </w:pPr>
+      <w:r>
+        <w:rPr>
+          <w:bCs/>
+          <w:b/>
+        </w:rPr>
         <w:t xml:space="preserve">Scalability.</w:t>
       </w:r>
       <w:r>
@@ -23903,9 +24060,9 @@
         <w:t xml:space="preserve">Nothing in the framework is specific to Albay. Its only inputs are public registers, OpenStreetMap, and the Sphere indicator, and it runs on everyday computers; any province that houses evacuees in schools, from Taal to Kanlaon, could therefore adopt it.</w:t>
       </w:r>
     </w:p>
-    <w:bookmarkEnd w:id="139"/>
-    <w:bookmarkEnd w:id="140"/>
-    <w:bookmarkStart w:id="141" w:name="references"/>
+    <w:bookmarkEnd w:id="143"/>
+    <w:bookmarkEnd w:id="144"/>
+    <w:bookmarkStart w:id="145" w:name="references"/>
     <w:p>
       <w:pPr>
         <w:pStyle w:val="Heading1"/>
@@ -25009,8 +25166,8 @@
         <w:t xml:space="preserve">(6), 80–83. https://doi.org/10.2307/3001968</w:t>
       </w:r>
     </w:p>
-    <w:bookmarkEnd w:id="141"/>
-    <w:bookmarkStart w:id="142" w:name="appendix-a.-open-data-source-register"/>
+    <w:bookmarkEnd w:id="145"/>
+    <w:bookmarkStart w:id="146" w:name="appendix-a.-open-data-source-register"/>
     <w:p>
       <w:pPr>
         <w:pStyle w:val="Heading1"/>
@@ -25750,8 +25907,8 @@
         </w:tc>
       </w:tr>
     </w:tbl>
-    <w:bookmarkEnd w:id="142"/>
-    <w:bookmarkStart w:id="143" w:name="appendix-b.-data-files-produced"/>
+    <w:bookmarkEnd w:id="146"/>
+    <w:bookmarkStart w:id="147" w:name="appendix-b.-data-files-produced"/>
     <w:p>
       <w:pPr>
         <w:pStyle w:val="Heading1"/>
@@ -26025,8 +26182,8 @@
         </w:tc>
       </w:tr>
     </w:tbl>
-    <w:bookmarkEnd w:id="143"/>
-    <w:bookmarkStart w:id="144" w:name="Xadb28e3b89f1d7719eaeca47e56bd79a3f7085a"/>
+    <w:bookmarkEnd w:id="147"/>
+    <w:bookmarkStart w:id="148" w:name="Xadb28e3b89f1d7719eaeca47e56bd79a3f7085a"/>
     <w:p>
       <w:pPr>
         <w:pStyle w:val="Heading1"/>
@@ -26057,7 +26214,7 @@
       <w:pPr>
         <w:numPr>
           <w:ilvl w:val="0"/>
-          <w:numId w:val="1008"/>
+          <w:numId w:val="1009"/>
         </w:numPr>
         <w:pStyle w:val="Compact"/>
       </w:pPr>
@@ -26069,7 +26226,7 @@
       <w:pPr>
         <w:numPr>
           <w:ilvl w:val="0"/>
-          <w:numId w:val="1008"/>
+          <w:numId w:val="1009"/>
         </w:numPr>
         <w:pStyle w:val="Compact"/>
       </w:pPr>
@@ -26081,7 +26238,7 @@
       <w:pPr>
         <w:numPr>
           <w:ilvl w:val="0"/>
-          <w:numId w:val="1008"/>
+          <w:numId w:val="1009"/>
         </w:numPr>
         <w:pStyle w:val="Compact"/>
       </w:pPr>
@@ -26093,7 +26250,7 @@
       <w:pPr>
         <w:numPr>
           <w:ilvl w:val="0"/>
-          <w:numId w:val="1008"/>
+          <w:numId w:val="1009"/>
         </w:numPr>
         <w:pStyle w:val="Compact"/>
       </w:pPr>
@@ -26849,8 +27006,8 @@
         </w:tc>
       </w:tr>
     </w:tbl>
-    <w:bookmarkEnd w:id="144"/>
-    <w:bookmarkStart w:id="145" w:name="Xe983620f88fd7224d1947cb537bbdfb61995160"/>
+    <w:bookmarkEnd w:id="148"/>
+    <w:bookmarkStart w:id="149" w:name="Xe983620f88fd7224d1947cb537bbdfb61995160"/>
     <w:p>
       <w:pPr>
         <w:pStyle w:val="Heading1"/>
@@ -26877,90 +27034,6 @@
           <w:b/>
         </w:rPr>
         <w:t xml:space="preserve">Planner mode (for the PDRRMO, APSEMO, and LGUs)</w:t>
-      </w:r>
-    </w:p>
-    <w:p>
-      <w:pPr>
-        <w:numPr>
-          <w:ilvl w:val="0"/>
-          <w:numId w:val="1009"/>
-        </w:numPr>
-        <w:pStyle w:val="Compact"/>
-      </w:pPr>
-      <w:r>
-        <w:t xml:space="preserve">A scenario switch for Alert Levels 3 and 4 and the compound lahar scenario, each with its active zones and closed bridges (targets 11.5 and 13.1).</w:t>
-      </w:r>
-    </w:p>
-    <w:p>
-      <w:pPr>
-        <w:numPr>
-          <w:ilvl w:val="0"/>
-          <w:numId w:val="1009"/>
-        </w:numPr>
-        <w:pStyle w:val="Compact"/>
-      </w:pPr>
-      <w:r>
-        <w:t xml:space="preserve">An editable table of origins (population, vulnerable residents) and shelters (floor areas, classrooms, accessibility), with capacities from the Sphere indicator computed on entry.</w:t>
-      </w:r>
-    </w:p>
-    <w:p>
-      <w:pPr>
-        <w:numPr>
-          <w:ilvl w:val="0"/>
-          <w:numId w:val="1009"/>
-        </w:numPr>
-        <w:pStyle w:val="Compact"/>
-      </w:pPr>
-      <w:r>
-        <w:t xml:space="preserve">The school-preserving plan of Algorithm 1, with persons per tier, classrooms closed, learners displaced, and classroom-days at a chosen length of stay (target 4.a).</w:t>
-      </w:r>
-    </w:p>
-    <w:p>
-      <w:pPr>
-        <w:numPr>
-          <w:ilvl w:val="0"/>
-          <w:numId w:val="1009"/>
-        </w:numPr>
-        <w:pStyle w:val="Compact"/>
-      </w:pPr>
-      <w:r>
-        <w:t xml:space="preserve">The time-only plan and the nearest-site rule side by side, so that the classrooms saved and the extra minutes are visible.</w:t>
-      </w:r>
-    </w:p>
-    <w:p>
-      <w:pPr>
-        <w:numPr>
-          <w:ilvl w:val="0"/>
-          <w:numId w:val="1009"/>
-        </w:numPr>
-        <w:pStyle w:val="Compact"/>
-      </w:pPr>
-      <w:r>
-        <w:t xml:space="preserve">The clearance time of Algorithm 2 with its lower bound, and the effect of closing each bridge or each lahar channel (target 11.5).</w:t>
-      </w:r>
-    </w:p>
-    <w:p>
-      <w:pPr>
-        <w:numPr>
-          <w:ilvl w:val="0"/>
-          <w:numId w:val="1009"/>
-        </w:numPr>
-        <w:pStyle w:val="Compact"/>
-      </w:pPr>
-      <w:r>
-        <w:t xml:space="preserve">Greedy siting of Ligtas Pinoy Centers with the guarantee of Proposition 10 (target 11.5).</w:t>
-      </w:r>
-    </w:p>
-    <w:p>
-      <w:pPr>
-        <w:pStyle w:val="FirstParagraph"/>
-      </w:pPr>
-      <w:r>
-        <w:rPr>
-          <w:bCs/>
-          <w:b/>
-        </w:rPr>
-        <w:t xml:space="preserve">Resident mode</w:t>
       </w:r>
     </w:p>
     <w:p>
@@ -26972,7 +27045,7 @@
         <w:pStyle w:val="Compact"/>
       </w:pPr>
       <w:r>
-        <w:t xml:space="preserve">A barangay picker that shows the assigned shelter at each alert level, the travel time, and whether it is accessible (target 10.2).</w:t>
+        <w:t xml:space="preserve">A scenario switch for Alert Levels 3 and 4 and the compound lahar scenario, each with its active zones and closed bridges (targets 11.5 and 13.1).</w:t>
       </w:r>
     </w:p>
     <w:p>
@@ -26984,7 +27057,7 @@
         <w:pStyle w:val="Compact"/>
       </w:pPr>
       <w:r>
-        <w:t xml:space="preserve">A capacity calculator that converts a floor area into persons at 3.5 square meters each.</w:t>
+        <w:t xml:space="preserve">An editable table of origins (population, vulnerable residents) and shelters (floor areas, classrooms, accessibility), with capacities from the Sphere indicator computed on entry.</w:t>
       </w:r>
     </w:p>
     <w:p>
@@ -26996,11 +27069,95 @@
         <w:pStyle w:val="Compact"/>
       </w:pPr>
       <w:r>
+        <w:t xml:space="preserve">The school-preserving plan of Algorithm 1, with persons per tier, classrooms closed, learners displaced, and classroom-days at a chosen length of stay (target 4.a).</w:t>
+      </w:r>
+    </w:p>
+    <w:p>
+      <w:pPr>
+        <w:numPr>
+          <w:ilvl w:val="0"/>
+          <w:numId w:val="1010"/>
+        </w:numPr>
+        <w:pStyle w:val="Compact"/>
+      </w:pPr>
+      <w:r>
+        <w:t xml:space="preserve">The time-only plan and the nearest-site rule side by side, so that the classrooms saved and the extra minutes are visible.</w:t>
+      </w:r>
+    </w:p>
+    <w:p>
+      <w:pPr>
+        <w:numPr>
+          <w:ilvl w:val="0"/>
+          <w:numId w:val="1010"/>
+        </w:numPr>
+        <w:pStyle w:val="Compact"/>
+      </w:pPr>
+      <w:r>
+        <w:t xml:space="preserve">The clearance time of Algorithm 2 with its lower bound, and the effect of closing each bridge or each lahar channel (target 11.5).</w:t>
+      </w:r>
+    </w:p>
+    <w:p>
+      <w:pPr>
+        <w:numPr>
+          <w:ilvl w:val="0"/>
+          <w:numId w:val="1010"/>
+        </w:numPr>
+        <w:pStyle w:val="Compact"/>
+      </w:pPr>
+      <w:r>
+        <w:t xml:space="preserve">Greedy siting of Ligtas Pinoy Centers with the guarantee of Proposition 10 (target 11.5).</w:t>
+      </w:r>
+    </w:p>
+    <w:p>
+      <w:pPr>
+        <w:pStyle w:val="FirstParagraph"/>
+      </w:pPr>
+      <w:r>
+        <w:rPr>
+          <w:bCs/>
+          <w:b/>
+        </w:rPr>
+        <w:t xml:space="preserve">Resident mode</w:t>
+      </w:r>
+    </w:p>
+    <w:p>
+      <w:pPr>
+        <w:numPr>
+          <w:ilvl w:val="0"/>
+          <w:numId w:val="1011"/>
+        </w:numPr>
+        <w:pStyle w:val="Compact"/>
+      </w:pPr>
+      <w:r>
+        <w:t xml:space="preserve">A barangay picker that shows the assigned shelter at each alert level, the travel time, and whether it is accessible (target 10.2).</w:t>
+      </w:r>
+    </w:p>
+    <w:p>
+      <w:pPr>
+        <w:numPr>
+          <w:ilvl w:val="0"/>
+          <w:numId w:val="1011"/>
+        </w:numPr>
+        <w:pStyle w:val="Compact"/>
+      </w:pPr>
+      <w:r>
+        <w:t xml:space="preserve">A capacity calculator that converts a floor area into persons at 3.5 square meters each.</w:t>
+      </w:r>
+    </w:p>
+    <w:p>
+      <w:pPr>
+        <w:numPr>
+          <w:ilvl w:val="0"/>
+          <w:numId w:val="1011"/>
+        </w:numPr>
+        <w:pStyle w:val="Compact"/>
+      </w:pPr>
+      <w:r>
         <w:t xml:space="preserve">Offline storage, so that the plan opens without a signal during a typhoon (target 13.1).</w:t>
       </w:r>
     </w:p>
-    <w:bookmarkEnd w:id="145"/>
-    <w:bookmarkStart w:id="146" w:name="appendix-e.-risk-register"/>
+    <w:bookmarkEnd w:id="149"/>
+    <w:bookmarkStart w:id="150" w:name="appendix-e.-risk-register"/>
     <w:p>
       <w:pPr>
         <w:pStyle w:val="Heading1"/>
@@ -27481,8 +27638,8 @@
         </w:tc>
       </w:tr>
     </w:tbl>
-    <w:bookmarkEnd w:id="146"/>
-    <w:bookmarkStart w:id="147" w:name="appendix-f.-reproducing-the-results"/>
+    <w:bookmarkEnd w:id="150"/>
+    <w:bookmarkStart w:id="151" w:name="appendix-f.-reproducing-the-results"/>
     <w:p>
       <w:pPr>
         <w:pStyle w:val="Heading1"/>
@@ -27542,7 +27699,7 @@
       <w:pPr>
         <w:numPr>
           <w:ilvl w:val="0"/>
-          <w:numId w:val="1011"/>
+          <w:numId w:val="1012"/>
         </w:numPr>
         <w:pStyle w:val="Compact"/>
       </w:pPr>
@@ -27554,7 +27711,7 @@
       <w:pPr>
         <w:numPr>
           <w:ilvl w:val="0"/>
-          <w:numId w:val="1011"/>
+          <w:numId w:val="1012"/>
         </w:numPr>
         <w:pStyle w:val="Compact"/>
       </w:pPr>
@@ -27566,7 +27723,7 @@
       <w:pPr>
         <w:numPr>
           <w:ilvl w:val="0"/>
-          <w:numId w:val="1011"/>
+          <w:numId w:val="1012"/>
         </w:numPr>
         <w:pStyle w:val="Compact"/>
       </w:pPr>
@@ -27578,7 +27735,7 @@
       <w:pPr>
         <w:numPr>
           <w:ilvl w:val="0"/>
-          <w:numId w:val="1011"/>
+          <w:numId w:val="1012"/>
         </w:numPr>
         <w:pStyle w:val="Compact"/>
       </w:pPr>
@@ -27590,7 +27747,7 @@
       <w:pPr>
         <w:numPr>
           <w:ilvl w:val="0"/>
-          <w:numId w:val="1011"/>
+          <w:numId w:val="1012"/>
         </w:numPr>
         <w:pStyle w:val="Compact"/>
       </w:pPr>
@@ -27606,8 +27763,8 @@
         <w:t xml:space="preserve">All numbers the script reports are model outputs computed from synthetic inputs; they describe no real shelter or school in Albay.</w:t>
       </w:r>
     </w:p>
-    <w:bookmarkEnd w:id="147"/>
-    <w:bookmarkStart w:id="148" w:name="ethics-statement"/>
+    <w:bookmarkEnd w:id="151"/>
+    <w:bookmarkStart w:id="152" w:name="ethics-statement"/>
     <w:p>
       <w:pPr>
         <w:pStyle w:val="Heading1"/>
@@ -27640,7 +27797,7 @@
         <w:t xml:space="preserve">Any plan must clear two checks before it reaches a local government: the protocol needs approval from the school’s Scientific Review Committee, and the offices that own the real shelter records must confirm them. Care was taken at every stage to keep the data sound. No figure in this paper measures an actual evacuation.</w:t>
       </w:r>
     </w:p>
-    <w:bookmarkEnd w:id="148"/>
+    <w:bookmarkEnd w:id="152"/>
     <w:sectPr>
       <w:footerReference w:type="default" r:id="rIdFooterPg"/>
       <w:pgSz w:w="12240" w:h="15840"/>
@@ -28151,6 +28308,9 @@
     <w:abstractNumId w:val="991"/>
   </w:num>
   <w:num w:numId="1005">
+    <w:abstractNumId w:val="991"/>
+  </w:num>
+  <w:num w:numId="1006">
     <w:abstractNumId w:val="99531"/>
     <w:lvlOverride w:ilvl="0">
       <w:startOverride w:val="1"/>
@@ -28180,41 +28340,11 @@
       <w:startOverride w:val="1"/>
     </w:lvlOverride>
   </w:num>
-  <w:num w:numId="1006">
-    <w:abstractNumId w:val="991"/>
-  </w:num>
   <w:num w:numId="1007">
     <w:abstractNumId w:val="991"/>
   </w:num>
   <w:num w:numId="1008">
-    <w:abstractNumId w:val="99411"/>
-    <w:lvlOverride w:ilvl="0">
-      <w:startOverride w:val="1"/>
-    </w:lvlOverride>
-    <w:lvlOverride w:ilvl="1">
-      <w:startOverride w:val="1"/>
-    </w:lvlOverride>
-    <w:lvlOverride w:ilvl="2">
-      <w:startOverride w:val="1"/>
-    </w:lvlOverride>
-    <w:lvlOverride w:ilvl="3">
-      <w:startOverride w:val="1"/>
-    </w:lvlOverride>
-    <w:lvlOverride w:ilvl="4">
-      <w:startOverride w:val="1"/>
-    </w:lvlOverride>
-    <w:lvlOverride w:ilvl="5">
-      <w:startOverride w:val="1"/>
-    </w:lvlOverride>
-    <w:lvlOverride w:ilvl="6">
-      <w:startOverride w:val="1"/>
-    </w:lvlOverride>
-    <w:lvlOverride w:ilvl="7">
-      <w:startOverride w:val="1"/>
-    </w:lvlOverride>
-    <w:lvlOverride w:ilvl="8">
-      <w:startOverride w:val="1"/>
-    </w:lvlOverride>
+    <w:abstractNumId w:val="991"/>
   </w:num>
   <w:num w:numId="1009">
     <w:abstractNumId w:val="99411"/>
@@ -28247,6 +28377,36 @@
     </w:lvlOverride>
   </w:num>
   <w:num w:numId="1010">
+    <w:abstractNumId w:val="99411"/>
+    <w:lvlOverride w:ilvl="0">
+      <w:startOverride w:val="1"/>
+    </w:lvlOverride>
+    <w:lvlOverride w:ilvl="1">
+      <w:startOverride w:val="1"/>
+    </w:lvlOverride>
+    <w:lvlOverride w:ilvl="2">
+      <w:startOverride w:val="1"/>
+    </w:lvlOverride>
+    <w:lvlOverride w:ilvl="3">
+      <w:startOverride w:val="1"/>
+    </w:lvlOverride>
+    <w:lvlOverride w:ilvl="4">
+      <w:startOverride w:val="1"/>
+    </w:lvlOverride>
+    <w:lvlOverride w:ilvl="5">
+      <w:startOverride w:val="1"/>
+    </w:lvlOverride>
+    <w:lvlOverride w:ilvl="6">
+      <w:startOverride w:val="1"/>
+    </w:lvlOverride>
+    <w:lvlOverride w:ilvl="7">
+      <w:startOverride w:val="1"/>
+    </w:lvlOverride>
+    <w:lvlOverride w:ilvl="8">
+      <w:startOverride w:val="1"/>
+    </w:lvlOverride>
+  </w:num>
+  <w:num w:numId="1011">
     <w:abstractNumId w:val="99417"/>
     <w:lvlOverride w:ilvl="0">
       <w:startOverride w:val="7"/>
@@ -28276,7 +28436,7 @@
       <w:startOverride w:val="7"/>
     </w:lvlOverride>
   </w:num>
-  <w:num w:numId="1011">
+  <w:num w:numId="1012">
     <w:abstractNumId w:val="99411"/>
     <w:lvlOverride w:ilvl="0">
       <w:startOverride w:val="1"/>

</xml_diff>